<commit_message>
Enhance manuscript with detailed performance evaluations of orbit estimation methods using 300-second and 900-second datasets. Added tables summarizing 3D position RMSE comparisons and improved clarity in graphical representations. Updated figures to reflect consistent results across analysis centers and highlighted performance differences among algorithms.
</commit_message>
<xml_diff>
--- a/Manuscript.docx
+++ b/Manuscript.docx
@@ -2482,10 +2482,11 @@
       <w:r>
         <w:rPr>
           <w:bCs/>
+          <w:noProof/>
           <w:szCs w:val="18"/>
         </w:rPr>
         <w:drawing>
-          <wp:inline distT="0" distB="0" distL="0" distR="0" wp14:anchorId="2942EEED" wp14:editId="5DF01C49">
+          <wp:inline distT="0" distB="0" distL="0" distR="0" wp14:anchorId="2942EEED" wp14:editId="54B9C3B0">
             <wp:extent cx="3209563" cy="1613061"/>
             <wp:effectExtent l="0" t="0" r="0" b="0"/>
             <wp:docPr id="1970336029" name="Resim 1" descr="metin, diyagram, ekran görüntüsü, yazı tipi içeren bir resim&#10;&#10;Yapay zeka tarafından oluşturulmuş içerik yanlış olabilir."/>
@@ -2535,6 +2536,8 @@
           <w:rFonts w:ascii="Times New Roman" w:hAnsi="Times New Roman" w:cs="Times New Roman"/>
           <w:b w:val="0"/>
           <w:color w:val="auto"/>
+          <w:sz w:val="16"/>
+          <w:szCs w:val="16"/>
         </w:rPr>
       </w:pPr>
       <w:bookmarkStart w:id="2" w:name="_Ref222158843"/>
@@ -2543,6 +2546,8 @@
           <w:rFonts w:ascii="Times New Roman" w:hAnsi="Times New Roman" w:cs="Times New Roman"/>
           <w:b w:val="0"/>
           <w:color w:val="auto"/>
+          <w:sz w:val="16"/>
+          <w:szCs w:val="16"/>
         </w:rPr>
         <w:t xml:space="preserve">Figure </w:t>
       </w:r>
@@ -2551,6 +2556,8 @@
           <w:rFonts w:ascii="Times New Roman" w:hAnsi="Times New Roman" w:cs="Times New Roman"/>
           <w:b w:val="0"/>
           <w:color w:val="auto"/>
+          <w:sz w:val="16"/>
+          <w:szCs w:val="16"/>
         </w:rPr>
         <w:fldChar w:fldCharType="begin"/>
       </w:r>
@@ -2559,6 +2566,8 @@
           <w:rFonts w:ascii="Times New Roman" w:hAnsi="Times New Roman" w:cs="Times New Roman"/>
           <w:b w:val="0"/>
           <w:color w:val="auto"/>
+          <w:sz w:val="16"/>
+          <w:szCs w:val="16"/>
         </w:rPr>
         <w:instrText xml:space="preserve"> SEQ Figure \* ARABIC </w:instrText>
       </w:r>
@@ -2567,31 +2576,40 @@
           <w:rFonts w:ascii="Times New Roman" w:hAnsi="Times New Roman" w:cs="Times New Roman"/>
           <w:b w:val="0"/>
           <w:color w:val="auto"/>
+          <w:sz w:val="16"/>
+          <w:szCs w:val="16"/>
         </w:rPr>
         <w:fldChar w:fldCharType="separate"/>
+      </w:r>
+      <w:r>
+        <w:rPr>
+          <w:rFonts w:ascii="Times New Roman" w:hAnsi="Times New Roman" w:cs="Times New Roman"/>
+          <w:b w:val="0"/>
+          <w:noProof/>
+          <w:color w:val="auto"/>
+          <w:sz w:val="16"/>
+          <w:szCs w:val="16"/>
+        </w:rPr>
+        <w:t>1</w:t>
       </w:r>
       <w:r>
         <w:rPr>
           <w:rFonts w:ascii="Times New Roman" w:hAnsi="Times New Roman" w:cs="Times New Roman"/>
           <w:b w:val="0"/>
           <w:color w:val="auto"/>
-        </w:rPr>
-        <w:t>1</w:t>
-      </w:r>
+          <w:sz w:val="16"/>
+          <w:szCs w:val="16"/>
+        </w:rPr>
+        <w:fldChar w:fldCharType="end"/>
+      </w:r>
+      <w:bookmarkEnd w:id="2"/>
       <w:r>
         <w:rPr>
           <w:rFonts w:ascii="Times New Roman" w:hAnsi="Times New Roman" w:cs="Times New Roman"/>
           <w:b w:val="0"/>
           <w:color w:val="auto"/>
-        </w:rPr>
-        <w:fldChar w:fldCharType="end"/>
-      </w:r>
-      <w:bookmarkEnd w:id="2"/>
-      <w:r>
-        <w:rPr>
-          <w:rFonts w:ascii="Times New Roman" w:hAnsi="Times New Roman" w:cs="Times New Roman"/>
-          <w:b w:val="0"/>
-          <w:color w:val="auto"/>
+          <w:sz w:val="16"/>
+          <w:szCs w:val="16"/>
         </w:rPr>
         <w:t>: Elements of the Kalman filter (Groves, 2008).</w:t>
       </w:r>
@@ -2785,6 +2803,7 @@
       <w:r>
         <w:rPr>
           <w:bCs/>
+          <w:noProof/>
           <w:szCs w:val="18"/>
         </w:rPr>
         <w:drawing>
@@ -2837,6 +2856,8 @@
         <w:rPr>
           <w:rFonts w:ascii="Times New Roman" w:hAnsi="Times New Roman" w:cs="Times New Roman"/>
           <w:b w:val="0"/>
+          <w:sz w:val="16"/>
+          <w:szCs w:val="16"/>
         </w:rPr>
       </w:pPr>
       <w:r>
@@ -2844,6 +2865,8 @@
           <w:rFonts w:ascii="Times New Roman" w:hAnsi="Times New Roman" w:cs="Times New Roman"/>
           <w:b w:val="0"/>
           <w:color w:val="auto"/>
+          <w:sz w:val="16"/>
+          <w:szCs w:val="16"/>
         </w:rPr>
         <w:t xml:space="preserve">Figure </w:t>
       </w:r>
@@ -2852,6 +2875,8 @@
           <w:rFonts w:ascii="Times New Roman" w:hAnsi="Times New Roman" w:cs="Times New Roman"/>
           <w:b w:val="0"/>
           <w:color w:val="auto"/>
+          <w:sz w:val="16"/>
+          <w:szCs w:val="16"/>
         </w:rPr>
         <w:fldChar w:fldCharType="begin"/>
       </w:r>
@@ -2860,6 +2885,8 @@
           <w:rFonts w:ascii="Times New Roman" w:hAnsi="Times New Roman" w:cs="Times New Roman"/>
           <w:b w:val="0"/>
           <w:color w:val="auto"/>
+          <w:sz w:val="16"/>
+          <w:szCs w:val="16"/>
         </w:rPr>
         <w:instrText xml:space="preserve"> SEQ Figure \* ARABIC </w:instrText>
       </w:r>
@@ -2868,30 +2895,39 @@
           <w:rFonts w:ascii="Times New Roman" w:hAnsi="Times New Roman" w:cs="Times New Roman"/>
           <w:b w:val="0"/>
           <w:color w:val="auto"/>
+          <w:sz w:val="16"/>
+          <w:szCs w:val="16"/>
         </w:rPr>
         <w:fldChar w:fldCharType="separate"/>
+      </w:r>
+      <w:r>
+        <w:rPr>
+          <w:rFonts w:ascii="Times New Roman" w:hAnsi="Times New Roman" w:cs="Times New Roman"/>
+          <w:b w:val="0"/>
+          <w:noProof/>
+          <w:color w:val="auto"/>
+          <w:sz w:val="16"/>
+          <w:szCs w:val="16"/>
+        </w:rPr>
+        <w:t>2</w:t>
       </w:r>
       <w:r>
         <w:rPr>
           <w:rFonts w:ascii="Times New Roman" w:hAnsi="Times New Roman" w:cs="Times New Roman"/>
           <w:b w:val="0"/>
           <w:color w:val="auto"/>
-        </w:rPr>
-        <w:t>2</w:t>
+          <w:sz w:val="16"/>
+          <w:szCs w:val="16"/>
+        </w:rPr>
+        <w:fldChar w:fldCharType="end"/>
       </w:r>
       <w:r>
         <w:rPr>
           <w:rFonts w:ascii="Times New Roman" w:hAnsi="Times New Roman" w:cs="Times New Roman"/>
           <w:b w:val="0"/>
           <w:color w:val="auto"/>
-        </w:rPr>
-        <w:fldChar w:fldCharType="end"/>
-      </w:r>
-      <w:r>
-        <w:rPr>
-          <w:rFonts w:ascii="Times New Roman" w:hAnsi="Times New Roman" w:cs="Times New Roman"/>
-          <w:b w:val="0"/>
-          <w:color w:val="auto"/>
+          <w:sz w:val="16"/>
+          <w:szCs w:val="16"/>
         </w:rPr>
         <w:t>: Flow of Kalman Filter</w:t>
       </w:r>
@@ -7548,17 +7584,20 @@
     <w:p>
       <w:pPr>
         <w:pStyle w:val="ResimYazs"/>
-        <w:keepNext/>
         <w:jc w:val="center"/>
         <w:rPr>
           <w:rFonts w:ascii="Times New Roman" w:hAnsi="Times New Roman" w:cs="Times New Roman"/>
           <w:color w:val="auto"/>
+          <w:sz w:val="16"/>
+          <w:szCs w:val="16"/>
         </w:rPr>
       </w:pPr>
       <w:r>
         <w:rPr>
           <w:rFonts w:ascii="Times New Roman" w:hAnsi="Times New Roman" w:cs="Times New Roman"/>
           <w:color w:val="auto"/>
+          <w:sz w:val="16"/>
+          <w:szCs w:val="16"/>
         </w:rPr>
         <w:t xml:space="preserve">Table </w:t>
       </w:r>
@@ -7566,6 +7605,8 @@
         <w:rPr>
           <w:rFonts w:ascii="Times New Roman" w:hAnsi="Times New Roman" w:cs="Times New Roman"/>
           <w:color w:val="auto"/>
+          <w:sz w:val="16"/>
+          <w:szCs w:val="16"/>
         </w:rPr>
         <w:fldChar w:fldCharType="begin"/>
       </w:r>
@@ -7573,6 +7614,8 @@
         <w:rPr>
           <w:rFonts w:ascii="Times New Roman" w:hAnsi="Times New Roman" w:cs="Times New Roman"/>
           <w:color w:val="auto"/>
+          <w:sz w:val="16"/>
+          <w:szCs w:val="16"/>
         </w:rPr>
         <w:instrText xml:space="preserve"> SEQ Table \* ARABIC </w:instrText>
       </w:r>
@@ -7580,6 +7623,8 @@
         <w:rPr>
           <w:rFonts w:ascii="Times New Roman" w:hAnsi="Times New Roman" w:cs="Times New Roman"/>
           <w:color w:val="auto"/>
+          <w:sz w:val="16"/>
+          <w:szCs w:val="16"/>
         </w:rPr>
         <w:fldChar w:fldCharType="separate"/>
       </w:r>
@@ -7587,6 +7632,8 @@
         <w:rPr>
           <w:rFonts w:ascii="Times New Roman" w:hAnsi="Times New Roman" w:cs="Times New Roman"/>
           <w:color w:val="auto"/>
+          <w:sz w:val="16"/>
+          <w:szCs w:val="16"/>
         </w:rPr>
         <w:t>1</w:t>
       </w:r>
@@ -7594,6 +7641,8 @@
         <w:rPr>
           <w:rFonts w:ascii="Times New Roman" w:hAnsi="Times New Roman" w:cs="Times New Roman"/>
           <w:color w:val="auto"/>
+          <w:sz w:val="16"/>
+          <w:szCs w:val="16"/>
         </w:rPr>
         <w:fldChar w:fldCharType="end"/>
       </w:r>
@@ -7601,6 +7650,8 @@
         <w:rPr>
           <w:rFonts w:ascii="Times New Roman" w:hAnsi="Times New Roman" w:cs="Times New Roman"/>
           <w:color w:val="auto"/>
+          <w:sz w:val="16"/>
+          <w:szCs w:val="16"/>
         </w:rPr>
         <w:t>: Precise orbit data provider used in this study</w:t>
       </w:r>
@@ -7638,12 +7689,16 @@
             <w:pPr>
               <w:rPr>
                 <w:bCs/>
+                <w:sz w:val="16"/>
+                <w:szCs w:val="16"/>
               </w:rPr>
             </w:pPr>
             <w:r>
               <w:rPr>
                 <w:rFonts w:eastAsia="Times New Roman"/>
                 <w:bCs/>
+                <w:sz w:val="16"/>
+                <w:szCs w:val="16"/>
               </w:rPr>
               <w:t>Anal</w:t>
             </w:r>
@@ -7651,6 +7706,8 @@
               <w:rPr>
                 <w:rFonts w:eastAsia="Times New Roman"/>
                 <w:bCs/>
+                <w:sz w:val="16"/>
+                <w:szCs w:val="16"/>
               </w:rPr>
               <w:t>y</w:t>
             </w:r>
@@ -7658,6 +7715,8 @@
               <w:rPr>
                 <w:rFonts w:eastAsia="Times New Roman"/>
                 <w:bCs/>
+                <w:sz w:val="16"/>
+                <w:szCs w:val="16"/>
               </w:rPr>
               <w:t>sis Center</w:t>
             </w:r>
@@ -7676,11 +7735,15 @@
             <w:pPr>
               <w:rPr>
                 <w:bCs/>
+                <w:sz w:val="16"/>
+                <w:szCs w:val="16"/>
               </w:rPr>
             </w:pPr>
             <w:r>
               <w:rPr>
                 <w:bCs/>
+                <w:sz w:val="16"/>
+                <w:szCs w:val="16"/>
               </w:rPr>
               <w:t>Institution</w:t>
             </w:r>
@@ -7699,11 +7762,15 @@
             <w:pPr>
               <w:rPr>
                 <w:bCs/>
+                <w:sz w:val="16"/>
+                <w:szCs w:val="16"/>
               </w:rPr>
             </w:pPr>
             <w:r>
               <w:rPr>
                 <w:bCs/>
+                <w:sz w:val="16"/>
+                <w:szCs w:val="16"/>
               </w:rPr>
               <w:t>Country</w:t>
             </w:r>
@@ -7721,11 +7788,15 @@
             <w:pPr>
               <w:rPr>
                 <w:bCs/>
+                <w:sz w:val="16"/>
+                <w:szCs w:val="16"/>
               </w:rPr>
             </w:pPr>
             <w:r>
               <w:rPr>
                 <w:bCs/>
+                <w:sz w:val="16"/>
+                <w:szCs w:val="16"/>
               </w:rPr>
               <w:t>SP3 Sampling Interval</w:t>
             </w:r>
@@ -7745,11 +7816,15 @@
             <w:pPr>
               <w:rPr>
                 <w:bCs/>
+                <w:sz w:val="16"/>
+                <w:szCs w:val="16"/>
               </w:rPr>
             </w:pPr>
             <w:r>
               <w:rPr>
                 <w:bCs/>
+                <w:sz w:val="16"/>
+                <w:szCs w:val="16"/>
               </w:rPr>
               <w:t>CODE</w:t>
             </w:r>
@@ -7768,11 +7843,15 @@
             <w:pPr>
               <w:rPr>
                 <w:bCs/>
+                <w:sz w:val="16"/>
+                <w:szCs w:val="16"/>
               </w:rPr>
             </w:pPr>
             <w:r>
               <w:rPr>
                 <w:bCs/>
+                <w:sz w:val="16"/>
+                <w:szCs w:val="16"/>
               </w:rPr>
               <w:t>Center for Orbit Determination in Europe, University of Bern</w:t>
             </w:r>
@@ -7791,11 +7870,15 @@
             <w:pPr>
               <w:rPr>
                 <w:bCs/>
+                <w:sz w:val="16"/>
+                <w:szCs w:val="16"/>
               </w:rPr>
             </w:pPr>
             <w:r>
               <w:rPr>
                 <w:bCs/>
+                <w:sz w:val="16"/>
+                <w:szCs w:val="16"/>
               </w:rPr>
               <w:t>Switzerland</w:t>
             </w:r>
@@ -7813,11 +7896,15 @@
             <w:pPr>
               <w:rPr>
                 <w:bCs/>
+                <w:sz w:val="16"/>
+                <w:szCs w:val="16"/>
               </w:rPr>
             </w:pPr>
             <w:r>
               <w:rPr>
                 <w:bCs/>
+                <w:sz w:val="16"/>
+                <w:szCs w:val="16"/>
               </w:rPr>
               <w:t>5 min</w:t>
             </w:r>
@@ -7836,11 +7923,15 @@
             <w:pPr>
               <w:rPr>
                 <w:bCs/>
+                <w:sz w:val="16"/>
+                <w:szCs w:val="16"/>
               </w:rPr>
             </w:pPr>
             <w:r>
               <w:rPr>
                 <w:bCs/>
+                <w:sz w:val="16"/>
+                <w:szCs w:val="16"/>
               </w:rPr>
               <w:t>GFZ</w:t>
             </w:r>
@@ -7858,12 +7949,16 @@
             <w:pPr>
               <w:rPr>
                 <w:bCs/>
+                <w:sz w:val="16"/>
+                <w:szCs w:val="16"/>
               </w:rPr>
             </w:pPr>
             <w:proofErr w:type="spellStart"/>
             <w:r>
               <w:rPr>
                 <w:bCs/>
+                <w:sz w:val="16"/>
+                <w:szCs w:val="16"/>
               </w:rPr>
               <w:t>GeoForschungsZentrum</w:t>
             </w:r>
@@ -7871,6 +7966,8 @@
             <w:r>
               <w:rPr>
                 <w:bCs/>
+                <w:sz w:val="16"/>
+                <w:szCs w:val="16"/>
               </w:rPr>
               <w:t xml:space="preserve"> Potsdam</w:t>
             </w:r>
@@ -7888,11 +7985,15 @@
             <w:pPr>
               <w:rPr>
                 <w:bCs/>
+                <w:sz w:val="16"/>
+                <w:szCs w:val="16"/>
               </w:rPr>
             </w:pPr>
             <w:r>
               <w:rPr>
                 <w:bCs/>
+                <w:sz w:val="16"/>
+                <w:szCs w:val="16"/>
               </w:rPr>
               <w:t>Germany</w:t>
             </w:r>
@@ -7909,11 +8010,15 @@
             <w:pPr>
               <w:rPr>
                 <w:bCs/>
+                <w:sz w:val="16"/>
+                <w:szCs w:val="16"/>
               </w:rPr>
             </w:pPr>
             <w:r>
               <w:rPr>
                 <w:bCs/>
+                <w:sz w:val="16"/>
+                <w:szCs w:val="16"/>
               </w:rPr>
               <w:t>5 min</w:t>
             </w:r>
@@ -7932,11 +8037,15 @@
             <w:pPr>
               <w:rPr>
                 <w:bCs/>
+                <w:sz w:val="16"/>
+                <w:szCs w:val="16"/>
               </w:rPr>
             </w:pPr>
             <w:r>
               <w:rPr>
                 <w:bCs/>
+                <w:sz w:val="16"/>
+                <w:szCs w:val="16"/>
               </w:rPr>
               <w:t>JAXA</w:t>
             </w:r>
@@ -7954,11 +8063,15 @@
             <w:pPr>
               <w:rPr>
                 <w:bCs/>
+                <w:sz w:val="16"/>
+                <w:szCs w:val="16"/>
               </w:rPr>
             </w:pPr>
             <w:r>
               <w:rPr>
                 <w:bCs/>
+                <w:sz w:val="16"/>
+                <w:szCs w:val="16"/>
               </w:rPr>
               <w:t>Japan Aerospace Exploration</w:t>
             </w:r>
@@ -7976,11 +8089,15 @@
             <w:pPr>
               <w:rPr>
                 <w:bCs/>
+                <w:sz w:val="16"/>
+                <w:szCs w:val="16"/>
               </w:rPr>
             </w:pPr>
             <w:r>
               <w:rPr>
                 <w:bCs/>
+                <w:sz w:val="16"/>
+                <w:szCs w:val="16"/>
               </w:rPr>
               <w:t>Japan</w:t>
             </w:r>
@@ -7997,11 +8114,15 @@
             <w:pPr>
               <w:rPr>
                 <w:bCs/>
+                <w:sz w:val="16"/>
+                <w:szCs w:val="16"/>
               </w:rPr>
             </w:pPr>
             <w:r>
               <w:rPr>
                 <w:bCs/>
+                <w:sz w:val="16"/>
+                <w:szCs w:val="16"/>
               </w:rPr>
               <w:t>5 min</w:t>
             </w:r>
@@ -8020,11 +8141,15 @@
             <w:pPr>
               <w:rPr>
                 <w:bCs/>
+                <w:sz w:val="16"/>
+                <w:szCs w:val="16"/>
               </w:rPr>
             </w:pPr>
             <w:r>
               <w:rPr>
                 <w:bCs/>
+                <w:sz w:val="16"/>
+                <w:szCs w:val="16"/>
               </w:rPr>
               <w:t>GRG</w:t>
             </w:r>
@@ -8042,11 +8167,15 @@
             <w:pPr>
               <w:rPr>
                 <w:bCs/>
+                <w:sz w:val="16"/>
+                <w:szCs w:val="16"/>
               </w:rPr>
             </w:pPr>
             <w:r>
               <w:rPr>
                 <w:bCs/>
+                <w:sz w:val="16"/>
+                <w:szCs w:val="16"/>
               </w:rPr>
               <w:t>CNES/CLS Analysis Center</w:t>
             </w:r>
@@ -8064,11 +8193,15 @@
             <w:pPr>
               <w:rPr>
                 <w:bCs/>
+                <w:sz w:val="16"/>
+                <w:szCs w:val="16"/>
               </w:rPr>
             </w:pPr>
             <w:r>
               <w:rPr>
                 <w:bCs/>
+                <w:sz w:val="16"/>
+                <w:szCs w:val="16"/>
               </w:rPr>
               <w:t>France</w:t>
             </w:r>
@@ -8085,11 +8218,15 @@
             <w:pPr>
               <w:rPr>
                 <w:bCs/>
+                <w:sz w:val="16"/>
+                <w:szCs w:val="16"/>
               </w:rPr>
             </w:pPr>
             <w:r>
               <w:rPr>
                 <w:bCs/>
+                <w:sz w:val="16"/>
+                <w:szCs w:val="16"/>
               </w:rPr>
               <w:t>15 min</w:t>
             </w:r>
@@ -8109,11 +8246,15 @@
             <w:pPr>
               <w:rPr>
                 <w:bCs/>
+                <w:sz w:val="16"/>
+                <w:szCs w:val="16"/>
               </w:rPr>
             </w:pPr>
             <w:r>
               <w:rPr>
                 <w:bCs/>
+                <w:sz w:val="16"/>
+                <w:szCs w:val="16"/>
               </w:rPr>
               <w:t>SHA</w:t>
             </w:r>
@@ -8132,11 +8273,15 @@
             <w:pPr>
               <w:rPr>
                 <w:bCs/>
+                <w:sz w:val="16"/>
+                <w:szCs w:val="16"/>
               </w:rPr>
             </w:pPr>
             <w:r>
               <w:rPr>
                 <w:bCs/>
+                <w:sz w:val="16"/>
+                <w:szCs w:val="16"/>
               </w:rPr>
               <w:t>Shanghai Astronomical Observatory</w:t>
             </w:r>
@@ -8155,11 +8300,15 @@
             <w:pPr>
               <w:rPr>
                 <w:bCs/>
+                <w:sz w:val="16"/>
+                <w:szCs w:val="16"/>
               </w:rPr>
             </w:pPr>
             <w:r>
               <w:rPr>
                 <w:bCs/>
+                <w:sz w:val="16"/>
+                <w:szCs w:val="16"/>
               </w:rPr>
               <w:t>China</w:t>
             </w:r>
@@ -8177,17 +8326,23 @@
             <w:pPr>
               <w:rPr>
                 <w:bCs/>
+                <w:sz w:val="16"/>
+                <w:szCs w:val="16"/>
               </w:rPr>
             </w:pPr>
             <w:r>
               <w:rPr>
                 <w:bCs/>
+                <w:sz w:val="16"/>
+                <w:szCs w:val="16"/>
               </w:rPr>
               <w:t>15 m</w:t>
             </w:r>
             <w:r>
               <w:rPr>
                 <w:bCs/>
+                <w:sz w:val="16"/>
+                <w:szCs w:val="16"/>
               </w:rPr>
               <w:t>in</w:t>
             </w:r>
@@ -9003,11 +9158,14 @@
         <w:rPr>
           <w:bCs/>
         </w:rPr>
+        <w:t xml:space="preserve">To objectively evaluate the interpolation and prediction performance of the applied models on real satellite orbit, a </w:t>
+      </w:r>
+      <w:r>
+        <w:t xml:space="preserve">Leave-One-Out Cross-Validation (LOO-CV) strategy was adopted. This approach was selected because it maximizes the utilization </w:t>
+      </w:r>
+      <w:r>
         <w:lastRenderedPageBreak/>
-        <w:t xml:space="preserve">To objectively evaluate the interpolation and prediction performance of the applied models on real satellite orbit, a </w:t>
-      </w:r>
-      <w:r>
-        <w:t>Leave-One-Out Cross-Validation (LOO-CV) strategy was adopted. This approach was selected because it maximizes the utilization of available observations while providing an unbiased estimate of the model’s generalization capability for each individual epoch, which is particularly beneficial for time</w:t>
+        <w:t>of available observations while providing an unbiased estimate of the model’s generalization capability for each individual epoch, which is particularly beneficial for time</w:t>
       </w:r>
       <w:r>
         <w:t xml:space="preserve"> </w:t>
@@ -10078,244 +10236,797 @@
     </w:p>
     <w:p>
       <w:r>
-        <w:t xml:space="preserve">300 </w:t>
-      </w:r>
-      <w:proofErr w:type="spellStart"/>
-      <w:r>
-        <w:t>saniyelik</w:t>
-      </w:r>
-      <w:proofErr w:type="spellEnd"/>
-      <w:r>
-        <w:t xml:space="preserve"> </w:t>
-      </w:r>
-      <w:proofErr w:type="spellStart"/>
-      <w:r>
-        <w:t>veri</w:t>
-      </w:r>
-      <w:proofErr w:type="spellEnd"/>
-      <w:r>
-        <w:t xml:space="preserve"> </w:t>
-      </w:r>
-      <w:proofErr w:type="spellStart"/>
-      <w:r>
-        <w:t>setimiz</w:t>
-      </w:r>
-      <w:proofErr w:type="spellEnd"/>
-      <w:r>
-        <w:t xml:space="preserve"> CODE, GFZ </w:t>
-      </w:r>
-      <w:proofErr w:type="spellStart"/>
-      <w:r>
-        <w:t>ve</w:t>
-      </w:r>
-      <w:proofErr w:type="spellEnd"/>
-      <w:r>
-        <w:t xml:space="preserve"> JAXA </w:t>
-      </w:r>
-      <w:proofErr w:type="spellStart"/>
-      <w:r>
-        <w:t>analiz</w:t>
-      </w:r>
-      <w:proofErr w:type="spellEnd"/>
-      <w:r>
-        <w:t xml:space="preserve"> </w:t>
-      </w:r>
-      <w:proofErr w:type="spellStart"/>
-      <w:r>
-        <w:t>merkezleri</w:t>
-      </w:r>
-      <w:proofErr w:type="spellEnd"/>
-      <w:r>
-        <w:t xml:space="preserve"> </w:t>
-      </w:r>
-      <w:proofErr w:type="spellStart"/>
-      <w:r>
-        <w:t>tarafından</w:t>
-      </w:r>
-      <w:proofErr w:type="spellEnd"/>
-      <w:r>
-        <w:t xml:space="preserve"> </w:t>
-      </w:r>
-      <w:proofErr w:type="spellStart"/>
-      <w:r>
-        <w:t>üretilmiştir</w:t>
-      </w:r>
-      <w:proofErr w:type="spellEnd"/>
-      <w:r>
-        <w:t xml:space="preserve">. G11 </w:t>
-      </w:r>
-      <w:proofErr w:type="spellStart"/>
-      <w:r>
-        <w:t>uyduları</w:t>
-      </w:r>
-      <w:proofErr w:type="spellEnd"/>
-      <w:r>
-        <w:t xml:space="preserve"> </w:t>
-      </w:r>
-      <w:proofErr w:type="spellStart"/>
-      <w:r>
-        <w:t>üzerinden</w:t>
-      </w:r>
-      <w:proofErr w:type="spellEnd"/>
-      <w:r>
-        <w:t xml:space="preserve"> </w:t>
-      </w:r>
-      <w:r>
-        <w:t xml:space="preserve">CODE </w:t>
-      </w:r>
-      <w:proofErr w:type="spellStart"/>
-      <w:r>
-        <w:t>analiz</w:t>
-      </w:r>
-      <w:proofErr w:type="spellEnd"/>
-      <w:r>
-        <w:t xml:space="preserve"> </w:t>
-      </w:r>
-      <w:proofErr w:type="spellStart"/>
-      <w:r>
-        <w:t>merkezinin</w:t>
-      </w:r>
-      <w:proofErr w:type="spellEnd"/>
-      <w:r>
-        <w:t xml:space="preserve"> </w:t>
-      </w:r>
-      <w:proofErr w:type="spellStart"/>
-      <w:r>
-        <w:t>dataaseti</w:t>
-      </w:r>
-      <w:proofErr w:type="spellEnd"/>
-      <w:r>
-        <w:t xml:space="preserve"> </w:t>
-      </w:r>
-      <w:proofErr w:type="spellStart"/>
-      <w:r>
-        <w:t>kullanılarak</w:t>
-      </w:r>
-      <w:proofErr w:type="spellEnd"/>
-      <w:r>
-        <w:t xml:space="preserve"> </w:t>
-      </w:r>
-      <w:r>
-        <w:t xml:space="preserve">ML, EKF </w:t>
-      </w:r>
-      <w:proofErr w:type="spellStart"/>
-      <w:r>
-        <w:t>ve</w:t>
-      </w:r>
-      <w:proofErr w:type="spellEnd"/>
-      <w:r>
-        <w:t xml:space="preserve"> Lagrange </w:t>
-      </w:r>
-      <w:proofErr w:type="spellStart"/>
-      <w:r>
-        <w:t>kestirim</w:t>
-      </w:r>
-      <w:proofErr w:type="spellEnd"/>
-      <w:r>
-        <w:t xml:space="preserve"> </w:t>
-      </w:r>
-      <w:proofErr w:type="spellStart"/>
-      <w:r>
-        <w:t>algoritmaları</w:t>
-      </w:r>
-      <w:r>
-        <w:t>nın</w:t>
-      </w:r>
-      <w:proofErr w:type="spellEnd"/>
-      <w:r>
-        <w:t xml:space="preserve"> </w:t>
-      </w:r>
-      <w:proofErr w:type="spellStart"/>
-      <w:r>
-        <w:t>yörünge</w:t>
-      </w:r>
-      <w:proofErr w:type="spellEnd"/>
-      <w:r>
-        <w:t xml:space="preserve"> </w:t>
-      </w:r>
-      <w:proofErr w:type="spellStart"/>
-      <w:r>
-        <w:t>kestirim</w:t>
-      </w:r>
-      <w:proofErr w:type="spellEnd"/>
-      <w:r>
-        <w:t xml:space="preserve"> </w:t>
-      </w:r>
-      <w:proofErr w:type="spellStart"/>
-      <w:r>
-        <w:t>karşılaştırılması</w:t>
-      </w:r>
-      <w:proofErr w:type="spellEnd"/>
-      <w:r>
-        <w:t xml:space="preserve"> </w:t>
-      </w:r>
-      <w:proofErr w:type="spellStart"/>
-      <w:r>
-        <w:t>Şekil</w:t>
-      </w:r>
-      <w:proofErr w:type="spellEnd"/>
-      <w:r>
-        <w:t xml:space="preserve"> 3</w:t>
-      </w:r>
-      <w:r>
-        <w:t>’</w:t>
-      </w:r>
-      <w:r>
-        <w:t>de</w:t>
-      </w:r>
-      <w:r>
-        <w:t xml:space="preserve"> </w:t>
-      </w:r>
-      <w:proofErr w:type="spellStart"/>
-      <w:r>
-        <w:t>ve</w:t>
-      </w:r>
-      <w:proofErr w:type="spellEnd"/>
-      <w:r>
-        <w:t xml:space="preserve"> </w:t>
-      </w:r>
-      <w:proofErr w:type="spellStart"/>
-      <w:r>
-        <w:t>kestirimlerin</w:t>
-      </w:r>
-      <w:proofErr w:type="spellEnd"/>
-      <w:r>
-        <w:t xml:space="preserve"> </w:t>
-      </w:r>
-      <w:proofErr w:type="spellStart"/>
-      <w:r>
-        <w:t>konum</w:t>
-      </w:r>
-      <w:proofErr w:type="spellEnd"/>
-      <w:r>
-        <w:t xml:space="preserve"> </w:t>
-      </w:r>
-      <w:proofErr w:type="spellStart"/>
-      <w:r>
-        <w:t>hatası</w:t>
-      </w:r>
-      <w:proofErr w:type="spellEnd"/>
-      <w:r>
-        <w:t xml:space="preserve"> </w:t>
-      </w:r>
-      <w:proofErr w:type="spellStart"/>
-      <w:r>
-        <w:t>Şekil</w:t>
-      </w:r>
-      <w:proofErr w:type="spellEnd"/>
-      <w:r>
-        <w:t xml:space="preserve"> 4’de</w:t>
-      </w:r>
-      <w:r>
-        <w:t xml:space="preserve"> </w:t>
-      </w:r>
-      <w:proofErr w:type="spellStart"/>
-      <w:r>
-        <w:t>gösterilmiştir</w:t>
-      </w:r>
-      <w:proofErr w:type="spellEnd"/>
-      <w:r>
-        <w:t>.</w:t>
+        <w:t>The one-day dataset with a 300-second sampling interval was generated by the CODE, GFZ, and JAXA analysis centers. The estimation performance of different algorithms was evaluated based on 3D position RMSE values and is presented in Table 2. It is observed that all three analysis centers produce highly consistent results across different estimation methods. Due to this consistency, the graphical representations are presented using the CODE dataset for clarity.</w:t>
+      </w:r>
+    </w:p>
+    <w:p>
+      <w:pPr>
+        <w:pStyle w:val="ResimYazs"/>
+        <w:jc w:val="center"/>
+        <w:rPr>
+          <w:rFonts w:ascii="Times New Roman" w:hAnsi="Times New Roman" w:cs="Times New Roman"/>
+          <w:color w:val="auto"/>
+          <w:sz w:val="16"/>
+          <w:szCs w:val="16"/>
+        </w:rPr>
+      </w:pPr>
+      <w:r>
+        <w:rPr>
+          <w:rFonts w:ascii="Times New Roman" w:hAnsi="Times New Roman" w:cs="Times New Roman"/>
+          <w:color w:val="auto"/>
+          <w:sz w:val="16"/>
+          <w:szCs w:val="16"/>
+        </w:rPr>
+        <w:t xml:space="preserve">Table </w:t>
+      </w:r>
+      <w:r>
+        <w:rPr>
+          <w:rFonts w:ascii="Times New Roman" w:hAnsi="Times New Roman" w:cs="Times New Roman"/>
+          <w:color w:val="auto"/>
+          <w:sz w:val="16"/>
+          <w:szCs w:val="16"/>
+        </w:rPr>
+        <w:fldChar w:fldCharType="begin"/>
+      </w:r>
+      <w:r>
+        <w:rPr>
+          <w:rFonts w:ascii="Times New Roman" w:hAnsi="Times New Roman" w:cs="Times New Roman"/>
+          <w:color w:val="auto"/>
+          <w:sz w:val="16"/>
+          <w:szCs w:val="16"/>
+        </w:rPr>
+        <w:instrText xml:space="preserve"> SEQ Table \* ARABIC </w:instrText>
+      </w:r>
+      <w:r>
+        <w:rPr>
+          <w:rFonts w:ascii="Times New Roman" w:hAnsi="Times New Roman" w:cs="Times New Roman"/>
+          <w:color w:val="auto"/>
+          <w:sz w:val="16"/>
+          <w:szCs w:val="16"/>
+        </w:rPr>
+        <w:fldChar w:fldCharType="separate"/>
+      </w:r>
+      <w:r>
+        <w:rPr>
+          <w:rFonts w:ascii="Times New Roman" w:hAnsi="Times New Roman" w:cs="Times New Roman"/>
+          <w:color w:val="auto"/>
+          <w:sz w:val="16"/>
+          <w:szCs w:val="16"/>
+        </w:rPr>
+        <w:t>2</w:t>
+      </w:r>
+      <w:r>
+        <w:rPr>
+          <w:rFonts w:ascii="Times New Roman" w:hAnsi="Times New Roman" w:cs="Times New Roman"/>
+          <w:color w:val="auto"/>
+          <w:sz w:val="16"/>
+          <w:szCs w:val="16"/>
+        </w:rPr>
+        <w:fldChar w:fldCharType="end"/>
+      </w:r>
+      <w:r>
+        <w:rPr>
+          <w:rFonts w:ascii="Times New Roman" w:hAnsi="Times New Roman" w:cs="Times New Roman"/>
+          <w:color w:val="auto"/>
+          <w:sz w:val="16"/>
+          <w:szCs w:val="16"/>
+        </w:rPr>
+        <w:t xml:space="preserve">: </w:t>
+      </w:r>
+      <w:r>
+        <w:rPr>
+          <w:rFonts w:ascii="Times New Roman" w:hAnsi="Times New Roman" w:cs="Times New Roman"/>
+          <w:color w:val="auto"/>
+          <w:sz w:val="16"/>
+          <w:szCs w:val="16"/>
+        </w:rPr>
+        <w:t xml:space="preserve">3D Position RMSE Comparison of Orbit Estimation Methods for </w:t>
+      </w:r>
+      <w:r>
+        <w:rPr>
+          <w:rFonts w:ascii="Times New Roman" w:hAnsi="Times New Roman" w:cs="Times New Roman"/>
+          <w:color w:val="auto"/>
+          <w:sz w:val="16"/>
+          <w:szCs w:val="16"/>
+        </w:rPr>
+        <w:t>3</w:t>
+      </w:r>
+      <w:r>
+        <w:rPr>
+          <w:rFonts w:ascii="Times New Roman" w:hAnsi="Times New Roman" w:cs="Times New Roman"/>
+          <w:color w:val="auto"/>
+          <w:sz w:val="16"/>
+          <w:szCs w:val="16"/>
+        </w:rPr>
+        <w:t>00-Second Interval Datasets</w:t>
+      </w:r>
+    </w:p>
+    <w:tbl>
+      <w:tblPr>
+        <w:tblStyle w:val="TabloKlavuzu"/>
+        <w:tblW w:w="0" w:type="auto"/>
+        <w:tblLook w:val="04A0" w:firstRow="1" w:lastRow="0" w:firstColumn="1" w:lastColumn="0" w:noHBand="0" w:noVBand="1"/>
+      </w:tblPr>
+      <w:tblGrid>
+        <w:gridCol w:w="3397"/>
+        <w:gridCol w:w="1134"/>
+        <w:gridCol w:w="1134"/>
+        <w:gridCol w:w="993"/>
+        <w:gridCol w:w="992"/>
+        <w:gridCol w:w="545"/>
+        <w:gridCol w:w="821"/>
+      </w:tblGrid>
+      <w:tr>
+        <w:tc>
+          <w:tcPr>
+            <w:tcW w:w="3397" w:type="dxa"/>
+          </w:tcPr>
+          <w:p>
+            <w:pPr>
+              <w:rPr>
+                <w:sz w:val="16"/>
+                <w:szCs w:val="16"/>
+              </w:rPr>
+            </w:pPr>
+            <w:r>
+              <w:rPr>
+                <w:sz w:val="16"/>
+                <w:szCs w:val="16"/>
+              </w:rPr>
+              <w:t>3D Position RMS (Satellite G11)</w:t>
+            </w:r>
+          </w:p>
+        </w:tc>
+        <w:tc>
+          <w:tcPr>
+            <w:tcW w:w="1134" w:type="dxa"/>
+          </w:tcPr>
+          <w:p>
+            <w:pPr>
+              <w:rPr>
+                <w:sz w:val="16"/>
+                <w:szCs w:val="16"/>
+              </w:rPr>
+            </w:pPr>
+            <w:r>
+              <w:rPr>
+                <w:sz w:val="16"/>
+                <w:szCs w:val="16"/>
+              </w:rPr>
+              <w:t>RF</w:t>
+            </w:r>
+          </w:p>
+        </w:tc>
+        <w:tc>
+          <w:tcPr>
+            <w:tcW w:w="1134" w:type="dxa"/>
+          </w:tcPr>
+          <w:p>
+            <w:pPr>
+              <w:rPr>
+                <w:sz w:val="16"/>
+                <w:szCs w:val="16"/>
+              </w:rPr>
+            </w:pPr>
+            <w:r>
+              <w:rPr>
+                <w:sz w:val="16"/>
+                <w:szCs w:val="16"/>
+              </w:rPr>
+              <w:t>SVR</w:t>
+            </w:r>
+          </w:p>
+        </w:tc>
+        <w:tc>
+          <w:tcPr>
+            <w:tcW w:w="993" w:type="dxa"/>
+          </w:tcPr>
+          <w:p>
+            <w:pPr>
+              <w:rPr>
+                <w:sz w:val="16"/>
+                <w:szCs w:val="16"/>
+              </w:rPr>
+            </w:pPr>
+            <w:r>
+              <w:rPr>
+                <w:sz w:val="16"/>
+                <w:szCs w:val="16"/>
+              </w:rPr>
+              <w:t>KNN</w:t>
+            </w:r>
+          </w:p>
+        </w:tc>
+        <w:tc>
+          <w:tcPr>
+            <w:tcW w:w="992" w:type="dxa"/>
+          </w:tcPr>
+          <w:p>
+            <w:pPr>
+              <w:rPr>
+                <w:sz w:val="16"/>
+                <w:szCs w:val="16"/>
+              </w:rPr>
+            </w:pPr>
+            <w:r>
+              <w:rPr>
+                <w:sz w:val="16"/>
+                <w:szCs w:val="16"/>
+              </w:rPr>
+              <w:t>MLP</w:t>
+            </w:r>
+          </w:p>
+        </w:tc>
+        <w:tc>
+          <w:tcPr>
+            <w:tcW w:w="545" w:type="dxa"/>
+          </w:tcPr>
+          <w:p>
+            <w:pPr>
+              <w:rPr>
+                <w:sz w:val="16"/>
+                <w:szCs w:val="16"/>
+              </w:rPr>
+            </w:pPr>
+            <w:r>
+              <w:rPr>
+                <w:sz w:val="16"/>
+                <w:szCs w:val="16"/>
+              </w:rPr>
+              <w:t>EKF</w:t>
+            </w:r>
+          </w:p>
+        </w:tc>
+        <w:tc>
+          <w:tcPr>
+            <w:tcW w:w="821" w:type="dxa"/>
+          </w:tcPr>
+          <w:p>
+            <w:pPr>
+              <w:rPr>
+                <w:sz w:val="16"/>
+                <w:szCs w:val="16"/>
+              </w:rPr>
+            </w:pPr>
+            <w:r>
+              <w:rPr>
+                <w:sz w:val="16"/>
+                <w:szCs w:val="16"/>
+              </w:rPr>
+              <w:t>Lagrange</w:t>
+            </w:r>
+          </w:p>
+        </w:tc>
+      </w:tr>
+      <w:tr>
+        <w:tc>
+          <w:tcPr>
+            <w:tcW w:w="3397" w:type="dxa"/>
+          </w:tcPr>
+          <w:p>
+            <w:pPr>
+              <w:rPr>
+                <w:sz w:val="16"/>
+                <w:szCs w:val="16"/>
+              </w:rPr>
+            </w:pPr>
+            <w:r>
+              <w:rPr>
+                <w:sz w:val="16"/>
+                <w:szCs w:val="16"/>
+              </w:rPr>
+              <w:t>CODE</w:t>
+            </w:r>
+          </w:p>
+        </w:tc>
+        <w:tc>
+          <w:tcPr>
+            <w:tcW w:w="1134" w:type="dxa"/>
+          </w:tcPr>
+          <w:p>
+            <w:pPr>
+              <w:rPr>
+                <w:sz w:val="16"/>
+                <w:szCs w:val="16"/>
+              </w:rPr>
+            </w:pPr>
+            <w:r>
+              <w:rPr>
+                <w:sz w:val="16"/>
+                <w:szCs w:val="16"/>
+              </w:rPr>
+              <w:t>175908</w:t>
+            </w:r>
+            <w:r>
+              <w:rPr>
+                <w:sz w:val="16"/>
+                <w:szCs w:val="16"/>
+              </w:rPr>
+              <w:t xml:space="preserve"> m</w:t>
+            </w:r>
+          </w:p>
+        </w:tc>
+        <w:tc>
+          <w:tcPr>
+            <w:tcW w:w="1134" w:type="dxa"/>
+          </w:tcPr>
+          <w:p>
+            <w:pPr>
+              <w:rPr>
+                <w:sz w:val="16"/>
+                <w:szCs w:val="16"/>
+              </w:rPr>
+            </w:pPr>
+            <w:r>
+              <w:rPr>
+                <w:sz w:val="16"/>
+                <w:szCs w:val="16"/>
+              </w:rPr>
+              <w:t>2959200</w:t>
+            </w:r>
+            <w:r>
+              <w:rPr>
+                <w:sz w:val="16"/>
+                <w:szCs w:val="16"/>
+              </w:rPr>
+              <w:t xml:space="preserve"> m</w:t>
+            </w:r>
+          </w:p>
+        </w:tc>
+        <w:tc>
+          <w:tcPr>
+            <w:tcW w:w="993" w:type="dxa"/>
+          </w:tcPr>
+          <w:p>
+            <w:pPr>
+              <w:rPr>
+                <w:sz w:val="16"/>
+                <w:szCs w:val="16"/>
+              </w:rPr>
+            </w:pPr>
+            <w:r>
+              <w:rPr>
+                <w:sz w:val="16"/>
+                <w:szCs w:val="16"/>
+              </w:rPr>
+              <w:t>353315</w:t>
+            </w:r>
+            <w:r>
+              <w:rPr>
+                <w:sz w:val="16"/>
+                <w:szCs w:val="16"/>
+              </w:rPr>
+              <w:t xml:space="preserve"> m</w:t>
+            </w:r>
+          </w:p>
+        </w:tc>
+        <w:tc>
+          <w:tcPr>
+            <w:tcW w:w="992" w:type="dxa"/>
+          </w:tcPr>
+          <w:p>
+            <w:pPr>
+              <w:rPr>
+                <w:sz w:val="16"/>
+                <w:szCs w:val="16"/>
+              </w:rPr>
+            </w:pPr>
+            <w:r>
+              <w:rPr>
+                <w:sz w:val="16"/>
+                <w:szCs w:val="16"/>
+              </w:rPr>
+              <w:t>5940889</w:t>
+            </w:r>
+            <w:r>
+              <w:rPr>
+                <w:sz w:val="16"/>
+                <w:szCs w:val="16"/>
+              </w:rPr>
+              <w:t xml:space="preserve"> m</w:t>
+            </w:r>
+          </w:p>
+        </w:tc>
+        <w:tc>
+          <w:tcPr>
+            <w:tcW w:w="545" w:type="dxa"/>
+          </w:tcPr>
+          <w:p>
+            <w:pPr>
+              <w:rPr>
+                <w:sz w:val="16"/>
+                <w:szCs w:val="16"/>
+              </w:rPr>
+            </w:pPr>
+            <w:r>
+              <w:rPr>
+                <w:sz w:val="16"/>
+                <w:szCs w:val="16"/>
+              </w:rPr>
+              <w:t>85</w:t>
+            </w:r>
+            <w:r>
+              <w:rPr>
+                <w:sz w:val="16"/>
+                <w:szCs w:val="16"/>
+              </w:rPr>
+              <w:t xml:space="preserve"> m</w:t>
+            </w:r>
+          </w:p>
+        </w:tc>
+        <w:tc>
+          <w:tcPr>
+            <w:tcW w:w="821" w:type="dxa"/>
+          </w:tcPr>
+          <w:p>
+            <w:pPr>
+              <w:rPr>
+                <w:sz w:val="16"/>
+                <w:szCs w:val="16"/>
+              </w:rPr>
+            </w:pPr>
+            <w:r>
+              <w:rPr>
+                <w:sz w:val="16"/>
+                <w:szCs w:val="16"/>
+              </w:rPr>
+              <w:t>62</w:t>
+            </w:r>
+            <w:r>
+              <w:rPr>
+                <w:sz w:val="16"/>
+                <w:szCs w:val="16"/>
+              </w:rPr>
+              <w:t xml:space="preserve"> m</w:t>
+            </w:r>
+          </w:p>
+        </w:tc>
+      </w:tr>
+      <w:tr>
+        <w:tc>
+          <w:tcPr>
+            <w:tcW w:w="3397" w:type="dxa"/>
+          </w:tcPr>
+          <w:p>
+            <w:pPr>
+              <w:rPr>
+                <w:sz w:val="16"/>
+                <w:szCs w:val="16"/>
+              </w:rPr>
+            </w:pPr>
+            <w:r>
+              <w:rPr>
+                <w:sz w:val="16"/>
+                <w:szCs w:val="16"/>
+              </w:rPr>
+              <w:t>GFZ</w:t>
+            </w:r>
+          </w:p>
+        </w:tc>
+        <w:tc>
+          <w:tcPr>
+            <w:tcW w:w="1134" w:type="dxa"/>
+          </w:tcPr>
+          <w:p>
+            <w:pPr>
+              <w:rPr>
+                <w:sz w:val="16"/>
+                <w:szCs w:val="16"/>
+              </w:rPr>
+            </w:pPr>
+            <w:r>
+              <w:rPr>
+                <w:sz w:val="16"/>
+                <w:szCs w:val="16"/>
+              </w:rPr>
+              <w:t>175300</w:t>
+            </w:r>
+            <w:r>
+              <w:rPr>
+                <w:sz w:val="16"/>
+                <w:szCs w:val="16"/>
+              </w:rPr>
+              <w:t xml:space="preserve"> m</w:t>
+            </w:r>
+          </w:p>
+        </w:tc>
+        <w:tc>
+          <w:tcPr>
+            <w:tcW w:w="1134" w:type="dxa"/>
+          </w:tcPr>
+          <w:p>
+            <w:pPr>
+              <w:rPr>
+                <w:sz w:val="16"/>
+                <w:szCs w:val="16"/>
+              </w:rPr>
+            </w:pPr>
+            <w:r>
+              <w:rPr>
+                <w:sz w:val="16"/>
+                <w:szCs w:val="16"/>
+              </w:rPr>
+              <w:t>291407</w:t>
+            </w:r>
+            <w:r>
+              <w:rPr>
+                <w:sz w:val="16"/>
+                <w:szCs w:val="16"/>
+              </w:rPr>
+              <w:t xml:space="preserve"> m</w:t>
+            </w:r>
+          </w:p>
+        </w:tc>
+        <w:tc>
+          <w:tcPr>
+            <w:tcW w:w="993" w:type="dxa"/>
+          </w:tcPr>
+          <w:p>
+            <w:pPr>
+              <w:rPr>
+                <w:sz w:val="16"/>
+                <w:szCs w:val="16"/>
+              </w:rPr>
+            </w:pPr>
+            <w:r>
+              <w:rPr>
+                <w:sz w:val="16"/>
+                <w:szCs w:val="16"/>
+              </w:rPr>
+              <w:t>354373</w:t>
+            </w:r>
+            <w:r>
+              <w:rPr>
+                <w:sz w:val="16"/>
+                <w:szCs w:val="16"/>
+              </w:rPr>
+              <w:t xml:space="preserve"> m</w:t>
+            </w:r>
+          </w:p>
+        </w:tc>
+        <w:tc>
+          <w:tcPr>
+            <w:tcW w:w="992" w:type="dxa"/>
+          </w:tcPr>
+          <w:p>
+            <w:pPr>
+              <w:rPr>
+                <w:sz w:val="16"/>
+                <w:szCs w:val="16"/>
+              </w:rPr>
+            </w:pPr>
+            <w:r>
+              <w:rPr>
+                <w:sz w:val="16"/>
+                <w:szCs w:val="16"/>
+              </w:rPr>
+              <w:t>5870083</w:t>
+            </w:r>
+            <w:r>
+              <w:rPr>
+                <w:sz w:val="16"/>
+                <w:szCs w:val="16"/>
+              </w:rPr>
+              <w:t xml:space="preserve"> m</w:t>
+            </w:r>
+          </w:p>
+        </w:tc>
+        <w:tc>
+          <w:tcPr>
+            <w:tcW w:w="545" w:type="dxa"/>
+          </w:tcPr>
+          <w:p>
+            <w:pPr>
+              <w:rPr>
+                <w:sz w:val="16"/>
+                <w:szCs w:val="16"/>
+              </w:rPr>
+            </w:pPr>
+            <w:r>
+              <w:rPr>
+                <w:sz w:val="16"/>
+                <w:szCs w:val="16"/>
+              </w:rPr>
+              <w:t>85</w:t>
+            </w:r>
+            <w:r>
+              <w:rPr>
+                <w:sz w:val="16"/>
+                <w:szCs w:val="16"/>
+              </w:rPr>
+              <w:t xml:space="preserve"> m</w:t>
+            </w:r>
+          </w:p>
+        </w:tc>
+        <w:tc>
+          <w:tcPr>
+            <w:tcW w:w="821" w:type="dxa"/>
+          </w:tcPr>
+          <w:p>
+            <w:pPr>
+              <w:rPr>
+                <w:sz w:val="16"/>
+                <w:szCs w:val="16"/>
+              </w:rPr>
+            </w:pPr>
+            <w:r>
+              <w:rPr>
+                <w:sz w:val="16"/>
+                <w:szCs w:val="16"/>
+              </w:rPr>
+              <w:t>62</w:t>
+            </w:r>
+            <w:r>
+              <w:rPr>
+                <w:sz w:val="16"/>
+                <w:szCs w:val="16"/>
+              </w:rPr>
+              <w:t xml:space="preserve"> m</w:t>
+            </w:r>
+          </w:p>
+        </w:tc>
+      </w:tr>
+      <w:tr>
+        <w:tc>
+          <w:tcPr>
+            <w:tcW w:w="3397" w:type="dxa"/>
+          </w:tcPr>
+          <w:p>
+            <w:pPr>
+              <w:rPr>
+                <w:sz w:val="16"/>
+                <w:szCs w:val="16"/>
+              </w:rPr>
+            </w:pPr>
+            <w:r>
+              <w:rPr>
+                <w:sz w:val="16"/>
+                <w:szCs w:val="16"/>
+              </w:rPr>
+              <w:t>JAXA</w:t>
+            </w:r>
+          </w:p>
+        </w:tc>
+        <w:tc>
+          <w:tcPr>
+            <w:tcW w:w="1134" w:type="dxa"/>
+          </w:tcPr>
+          <w:p>
+            <w:pPr>
+              <w:rPr>
+                <w:sz w:val="16"/>
+                <w:szCs w:val="16"/>
+              </w:rPr>
+            </w:pPr>
+            <w:r>
+              <w:rPr>
+                <w:sz w:val="16"/>
+                <w:szCs w:val="16"/>
+              </w:rPr>
+              <w:t>175908 m</w:t>
+            </w:r>
+          </w:p>
+        </w:tc>
+        <w:tc>
+          <w:tcPr>
+            <w:tcW w:w="1134" w:type="dxa"/>
+          </w:tcPr>
+          <w:p>
+            <w:pPr>
+              <w:rPr>
+                <w:sz w:val="16"/>
+                <w:szCs w:val="16"/>
+              </w:rPr>
+            </w:pPr>
+            <w:r>
+              <w:rPr>
+                <w:sz w:val="16"/>
+                <w:szCs w:val="16"/>
+              </w:rPr>
+              <w:t>2958565 m</w:t>
+            </w:r>
+          </w:p>
+        </w:tc>
+        <w:tc>
+          <w:tcPr>
+            <w:tcW w:w="993" w:type="dxa"/>
+          </w:tcPr>
+          <w:p>
+            <w:pPr>
+              <w:rPr>
+                <w:sz w:val="16"/>
+                <w:szCs w:val="16"/>
+              </w:rPr>
+            </w:pPr>
+            <w:r>
+              <w:rPr>
+                <w:sz w:val="16"/>
+                <w:szCs w:val="16"/>
+              </w:rPr>
+              <w:t>353315 m</w:t>
+            </w:r>
+          </w:p>
+        </w:tc>
+        <w:tc>
+          <w:tcPr>
+            <w:tcW w:w="992" w:type="dxa"/>
+          </w:tcPr>
+          <w:p>
+            <w:pPr>
+              <w:rPr>
+                <w:sz w:val="16"/>
+                <w:szCs w:val="16"/>
+              </w:rPr>
+            </w:pPr>
+            <w:r>
+              <w:rPr>
+                <w:sz w:val="16"/>
+                <w:szCs w:val="16"/>
+              </w:rPr>
+              <w:t>5940889 m</w:t>
+            </w:r>
+          </w:p>
+        </w:tc>
+        <w:tc>
+          <w:tcPr>
+            <w:tcW w:w="545" w:type="dxa"/>
+          </w:tcPr>
+          <w:p>
+            <w:pPr>
+              <w:rPr>
+                <w:sz w:val="16"/>
+                <w:szCs w:val="16"/>
+              </w:rPr>
+            </w:pPr>
+            <w:r>
+              <w:rPr>
+                <w:sz w:val="16"/>
+                <w:szCs w:val="16"/>
+              </w:rPr>
+              <w:t>85 m</w:t>
+            </w:r>
+          </w:p>
+        </w:tc>
+        <w:tc>
+          <w:tcPr>
+            <w:tcW w:w="821" w:type="dxa"/>
+          </w:tcPr>
+          <w:p>
+            <w:pPr>
+              <w:rPr>
+                <w:sz w:val="16"/>
+                <w:szCs w:val="16"/>
+              </w:rPr>
+            </w:pPr>
+            <w:r>
+              <w:rPr>
+                <w:sz w:val="16"/>
+                <w:szCs w:val="16"/>
+              </w:rPr>
+              <w:t>62 m</w:t>
+            </w:r>
+          </w:p>
+        </w:tc>
+      </w:tr>
+    </w:tbl>
+    <w:p>
+      <w:pPr>
+        <w:spacing w:before="120"/>
+      </w:pPr>
+      <w:r>
+        <w:t>As summarized in Table 2, EKF and Lagrange achieve the lowest RMSE values (85 m and 62 m, respectively), indicating superior estimation accuracy. RF and KNN exhibit moderate error levels, while SVR and MLP produce significantly higher RMSE values, reaching the order of kilometers. These numerical results clearly demonstrate the performance gap between model-based approaches and data-driven methods.</w:t>
+      </w:r>
+    </w:p>
+    <w:p>
+      <w:r>
+        <w:t>Due to the high consistency among analysis centers, the graphical analyses are presented using the CODE dataset. The orbit comparison results (Figure 3) show that EKF and Lagrange closely follow the reference trajectories across all coordinate components. RF and KNN demonstrate partial deviations, while SVR and especially MLP exhibit substantial discrepancies</w:t>
+      </w:r>
+      <w:r>
+        <w:t xml:space="preserve">. </w:t>
+      </w:r>
+      <w:r>
+        <w:lastRenderedPageBreak/>
+        <w:t>The corresponding model-based 3D position errors (Figure 4) indicate that EKF and Lagrange maintain low and stable error levels over time. RF produces moderate fluctuations, whereas SVR, KNN, and MLP result in significantly higher and less stable error profiles.</w:t>
       </w:r>
     </w:p>
     <w:p>
@@ -10324,11 +11035,13 @@
         <w:jc w:val="center"/>
       </w:pPr>
       <w:r>
-        <w:lastRenderedPageBreak/>
+        <w:rPr>
+          <w:noProof/>
+        </w:rPr>
         <w:drawing>
-          <wp:inline distT="0" distB="0" distL="0" distR="0" wp14:anchorId="2A08D08B" wp14:editId="397B58FD">
-            <wp:extent cx="4245610" cy="2336826"/>
-            <wp:effectExtent l="0" t="0" r="2540" b="6350"/>
+          <wp:inline distT="0" distB="0" distL="0" distR="0" wp14:anchorId="2A08D08B" wp14:editId="3483ED50">
+            <wp:extent cx="3745632" cy="2061633"/>
+            <wp:effectExtent l="0" t="0" r="7620" b="0"/>
             <wp:docPr id="1397800974" name="Resim 2"/>
             <wp:cNvGraphicFramePr>
               <a:graphicFrameLocks xmlns:a="http://schemas.openxmlformats.org/drawingml/2006/main" noChangeAspect="1"/>
@@ -10355,7 +11068,7 @@
                   <pic:spPr>
                     <a:xfrm>
                       <a:off x="0" y="0"/>
-                      <a:ext cx="4250826" cy="2339697"/>
+                      <a:ext cx="3754118" cy="2066304"/>
                     </a:xfrm>
                     <a:prstGeom prst="rect">
                       <a:avLst/>
@@ -10418,6 +11131,7 @@
       <w:r>
         <w:rPr>
           <w:rFonts w:ascii="Times New Roman" w:hAnsi="Times New Roman" w:cs="Times New Roman"/>
+          <w:noProof/>
           <w:color w:val="auto"/>
           <w:sz w:val="16"/>
           <w:szCs w:val="16"/>
@@ -10440,9 +11154,8 @@
           <w:sz w:val="16"/>
           <w:szCs w:val="16"/>
         </w:rPr>
-        <w:t xml:space="preserve">: CODE </w:t>
-      </w:r>
-      <w:proofErr w:type="spellStart"/>
+        <w:t xml:space="preserve">: </w:t>
+      </w:r>
       <w:r>
         <w:rPr>
           <w:rFonts w:ascii="Times New Roman" w:hAnsi="Times New Roman" w:cs="Times New Roman"/>
@@ -10450,9 +11163,8 @@
           <w:sz w:val="16"/>
           <w:szCs w:val="16"/>
         </w:rPr>
-        <w:t>analiz</w:t>
-      </w:r>
-      <w:proofErr w:type="spellEnd"/>
+        <w:t xml:space="preserve">Orbit Estimation Performance for the </w:t>
+      </w:r>
       <w:r>
         <w:rPr>
           <w:rFonts w:ascii="Times New Roman" w:hAnsi="Times New Roman" w:cs="Times New Roman"/>
@@ -10460,9 +11172,8 @@
           <w:sz w:val="16"/>
           <w:szCs w:val="16"/>
         </w:rPr>
-        <w:t xml:space="preserve"> </w:t>
-      </w:r>
-      <w:proofErr w:type="spellStart"/>
+        <w:t>CODE</w:t>
+      </w:r>
       <w:r>
         <w:rPr>
           <w:rFonts w:ascii="Times New Roman" w:hAnsi="Times New Roman" w:cs="Times New Roman"/>
@@ -10470,89 +11181,8 @@
           <w:sz w:val="16"/>
           <w:szCs w:val="16"/>
         </w:rPr>
-        <w:t>merkezinin</w:t>
-      </w:r>
-      <w:proofErr w:type="spellEnd"/>
-      <w:r>
-        <w:rPr>
-          <w:rFonts w:ascii="Times New Roman" w:hAnsi="Times New Roman" w:cs="Times New Roman"/>
-          <w:color w:val="auto"/>
-          <w:sz w:val="16"/>
-          <w:szCs w:val="16"/>
-        </w:rPr>
-        <w:t xml:space="preserve"> </w:t>
-      </w:r>
-      <w:proofErr w:type="spellStart"/>
-      <w:r>
-        <w:rPr>
-          <w:rFonts w:ascii="Times New Roman" w:hAnsi="Times New Roman" w:cs="Times New Roman"/>
-          <w:color w:val="auto"/>
-          <w:sz w:val="16"/>
-          <w:szCs w:val="16"/>
-        </w:rPr>
-        <w:t>farklı</w:t>
-      </w:r>
-      <w:proofErr w:type="spellEnd"/>
-      <w:r>
-        <w:rPr>
-          <w:rFonts w:ascii="Times New Roman" w:hAnsi="Times New Roman" w:cs="Times New Roman"/>
-          <w:color w:val="auto"/>
-          <w:sz w:val="16"/>
-          <w:szCs w:val="16"/>
-        </w:rPr>
-        <w:t xml:space="preserve"> </w:t>
-      </w:r>
-      <w:proofErr w:type="spellStart"/>
-      <w:r>
-        <w:rPr>
-          <w:rFonts w:ascii="Times New Roman" w:hAnsi="Times New Roman" w:cs="Times New Roman"/>
-          <w:color w:val="auto"/>
-          <w:sz w:val="16"/>
-          <w:szCs w:val="16"/>
-        </w:rPr>
-        <w:t>kestirim</w:t>
-      </w:r>
-      <w:proofErr w:type="spellEnd"/>
-      <w:r>
-        <w:rPr>
-          <w:rFonts w:ascii="Times New Roman" w:hAnsi="Times New Roman" w:cs="Times New Roman"/>
-          <w:color w:val="auto"/>
-          <w:sz w:val="16"/>
-          <w:szCs w:val="16"/>
-        </w:rPr>
-        <w:t xml:space="preserve"> </w:t>
-      </w:r>
-      <w:proofErr w:type="spellStart"/>
-      <w:r>
-        <w:rPr>
-          <w:rFonts w:ascii="Times New Roman" w:hAnsi="Times New Roman" w:cs="Times New Roman"/>
-          <w:color w:val="auto"/>
-          <w:sz w:val="16"/>
-          <w:szCs w:val="16"/>
-        </w:rPr>
-        <w:t>algoritmalarında</w:t>
-      </w:r>
-      <w:proofErr w:type="spellEnd"/>
-      <w:r>
-        <w:rPr>
-          <w:rFonts w:ascii="Times New Roman" w:hAnsi="Times New Roman" w:cs="Times New Roman"/>
-          <w:color w:val="auto"/>
-          <w:sz w:val="16"/>
-          <w:szCs w:val="16"/>
-        </w:rPr>
-        <w:t xml:space="preserve"> </w:t>
-      </w:r>
-      <w:proofErr w:type="spellStart"/>
-      <w:r>
-        <w:rPr>
-          <w:rFonts w:ascii="Times New Roman" w:hAnsi="Times New Roman" w:cs="Times New Roman"/>
-          <w:color w:val="auto"/>
-          <w:sz w:val="16"/>
-          <w:szCs w:val="16"/>
-        </w:rPr>
-        <w:t>performansı</w:t>
-      </w:r>
-      <w:proofErr w:type="spellEnd"/>
+        <w:t xml:space="preserve"> Analysis Center</w:t>
+      </w:r>
     </w:p>
     <w:p>
       <w:pPr>
@@ -10560,10 +11190,13 @@
         <w:jc w:val="center"/>
       </w:pPr>
       <w:r>
+        <w:rPr>
+          <w:noProof/>
+        </w:rPr>
         <w:drawing>
-          <wp:inline distT="0" distB="0" distL="0" distR="0" wp14:anchorId="68254625" wp14:editId="6D675570">
-            <wp:extent cx="4342977" cy="2153685"/>
-            <wp:effectExtent l="0" t="0" r="635" b="0"/>
+          <wp:inline distT="0" distB="0" distL="0" distR="0" wp14:anchorId="68254625" wp14:editId="21F0F8C2">
+            <wp:extent cx="3867105" cy="1917700"/>
+            <wp:effectExtent l="0" t="0" r="635" b="6350"/>
             <wp:docPr id="900136658" name="Resim 4"/>
             <wp:cNvGraphicFramePr>
               <a:graphicFrameLocks xmlns:a="http://schemas.openxmlformats.org/drawingml/2006/main" noChangeAspect="1"/>
@@ -10590,7 +11223,7 @@
                   <pic:spPr>
                     <a:xfrm>
                       <a:off x="0" y="0"/>
-                      <a:ext cx="4350875" cy="2157602"/>
+                      <a:ext cx="3881429" cy="1924803"/>
                     </a:xfrm>
                     <a:prstGeom prst="rect">
                       <a:avLst/>
@@ -10607,16 +11240,13 @@
       <w:pPr>
         <w:pStyle w:val="ResimYazs"/>
         <w:jc w:val="center"/>
-      </w:pPr>
-      <w:r>
         <w:rPr>
           <w:rFonts w:ascii="Times New Roman" w:hAnsi="Times New Roman" w:cs="Times New Roman"/>
           <w:color w:val="auto"/>
           <w:sz w:val="16"/>
           <w:szCs w:val="16"/>
         </w:rPr>
-        <w:t xml:space="preserve">Figure </w:t>
-      </w:r>
+      </w:pPr>
       <w:r>
         <w:rPr>
           <w:rFonts w:ascii="Times New Roman" w:hAnsi="Times New Roman" w:cs="Times New Roman"/>
@@ -10624,7 +11254,7 @@
           <w:sz w:val="16"/>
           <w:szCs w:val="16"/>
         </w:rPr>
-        <w:fldChar w:fldCharType="begin"/>
+        <w:t xml:space="preserve">Figure </w:t>
       </w:r>
       <w:r>
         <w:rPr>
@@ -10633,7 +11263,7 @@
           <w:sz w:val="16"/>
           <w:szCs w:val="16"/>
         </w:rPr>
-        <w:instrText xml:space="preserve"> SEQ Figure \* ARABIC </w:instrText>
+        <w:fldChar w:fldCharType="begin"/>
       </w:r>
       <w:r>
         <w:rPr>
@@ -10642,7 +11272,7 @@
           <w:sz w:val="16"/>
           <w:szCs w:val="16"/>
         </w:rPr>
-        <w:fldChar w:fldCharType="separate"/>
+        <w:instrText xml:space="preserve"> SEQ Figure \* ARABIC </w:instrText>
       </w:r>
       <w:r>
         <w:rPr>
@@ -10651,6 +11281,16 @@
           <w:sz w:val="16"/>
           <w:szCs w:val="16"/>
         </w:rPr>
+        <w:fldChar w:fldCharType="separate"/>
+      </w:r>
+      <w:r>
+        <w:rPr>
+          <w:rFonts w:ascii="Times New Roman" w:hAnsi="Times New Roman" w:cs="Times New Roman"/>
+          <w:noProof/>
+          <w:color w:val="auto"/>
+          <w:sz w:val="16"/>
+          <w:szCs w:val="16"/>
+        </w:rPr>
         <w:t>4</w:t>
       </w:r>
       <w:r>
@@ -10678,9 +11318,8 @@
           <w:sz w:val="16"/>
           <w:szCs w:val="16"/>
         </w:rPr>
-        <w:t xml:space="preserve">CODE </w:t>
-      </w:r>
-      <w:proofErr w:type="spellStart"/>
+        <w:t xml:space="preserve">Model-Based 3D Position Error (LOO-CV) for </w:t>
+      </w:r>
       <w:r>
         <w:rPr>
           <w:rFonts w:ascii="Times New Roman" w:hAnsi="Times New Roman" w:cs="Times New Roman"/>
@@ -10688,9 +11327,8 @@
           <w:sz w:val="16"/>
           <w:szCs w:val="16"/>
         </w:rPr>
-        <w:t>analiz</w:t>
-      </w:r>
-      <w:proofErr w:type="spellEnd"/>
+        <w:t>CODE</w:t>
+      </w:r>
       <w:r>
         <w:rPr>
           <w:rFonts w:ascii="Times New Roman" w:hAnsi="Times New Roman" w:cs="Times New Roman"/>
@@ -10698,220 +11336,12 @@
           <w:sz w:val="16"/>
           <w:szCs w:val="16"/>
         </w:rPr>
-        <w:t xml:space="preserve"> </w:t>
-      </w:r>
-      <w:proofErr w:type="spellStart"/>
-      <w:r>
-        <w:rPr>
-          <w:rFonts w:ascii="Times New Roman" w:hAnsi="Times New Roman" w:cs="Times New Roman"/>
-          <w:color w:val="auto"/>
-          <w:sz w:val="16"/>
-          <w:szCs w:val="16"/>
-        </w:rPr>
-        <w:t>merkezinin</w:t>
-      </w:r>
-      <w:proofErr w:type="spellEnd"/>
-      <w:r>
-        <w:rPr>
-          <w:rFonts w:ascii="Times New Roman" w:hAnsi="Times New Roman" w:cs="Times New Roman"/>
-          <w:color w:val="auto"/>
-          <w:sz w:val="16"/>
-          <w:szCs w:val="16"/>
-        </w:rPr>
-        <w:t xml:space="preserve"> </w:t>
-      </w:r>
-      <w:proofErr w:type="spellStart"/>
-      <w:r>
-        <w:rPr>
-          <w:rFonts w:ascii="Times New Roman" w:hAnsi="Times New Roman" w:cs="Times New Roman"/>
-          <w:color w:val="auto"/>
-          <w:sz w:val="16"/>
-          <w:szCs w:val="16"/>
-        </w:rPr>
-        <w:t>farklı</w:t>
-      </w:r>
-      <w:proofErr w:type="spellEnd"/>
-      <w:r>
-        <w:rPr>
-          <w:rFonts w:ascii="Times New Roman" w:hAnsi="Times New Roman" w:cs="Times New Roman"/>
-          <w:color w:val="auto"/>
-          <w:sz w:val="16"/>
-          <w:szCs w:val="16"/>
-        </w:rPr>
-        <w:t xml:space="preserve"> </w:t>
-      </w:r>
-      <w:proofErr w:type="spellStart"/>
-      <w:r>
-        <w:rPr>
-          <w:rFonts w:ascii="Times New Roman" w:hAnsi="Times New Roman" w:cs="Times New Roman"/>
-          <w:color w:val="auto"/>
-          <w:sz w:val="16"/>
-          <w:szCs w:val="16"/>
-        </w:rPr>
-        <w:t>kestirim</w:t>
-      </w:r>
-      <w:proofErr w:type="spellEnd"/>
-      <w:r>
-        <w:rPr>
-          <w:rFonts w:ascii="Times New Roman" w:hAnsi="Times New Roman" w:cs="Times New Roman"/>
-          <w:color w:val="auto"/>
-          <w:sz w:val="16"/>
-          <w:szCs w:val="16"/>
-        </w:rPr>
-        <w:t xml:space="preserve"> </w:t>
-      </w:r>
-      <w:proofErr w:type="spellStart"/>
-      <w:r>
-        <w:rPr>
-          <w:rFonts w:ascii="Times New Roman" w:hAnsi="Times New Roman" w:cs="Times New Roman"/>
-          <w:color w:val="auto"/>
-          <w:sz w:val="16"/>
-          <w:szCs w:val="16"/>
-        </w:rPr>
-        <w:t>algoritmalarında</w:t>
-      </w:r>
-      <w:proofErr w:type="spellEnd"/>
-      <w:r>
-        <w:rPr>
-          <w:rFonts w:ascii="Times New Roman" w:hAnsi="Times New Roman" w:cs="Times New Roman"/>
-          <w:color w:val="auto"/>
-          <w:sz w:val="16"/>
-          <w:szCs w:val="16"/>
-        </w:rPr>
-        <w:t xml:space="preserve"> </w:t>
-      </w:r>
-      <w:proofErr w:type="spellStart"/>
-      <w:r>
-        <w:rPr>
-          <w:rFonts w:ascii="Times New Roman" w:hAnsi="Times New Roman" w:cs="Times New Roman"/>
-          <w:color w:val="auto"/>
-          <w:sz w:val="16"/>
-          <w:szCs w:val="16"/>
-        </w:rPr>
-        <w:t>konum</w:t>
-      </w:r>
-      <w:proofErr w:type="spellEnd"/>
-      <w:r>
-        <w:rPr>
-          <w:rFonts w:ascii="Times New Roman" w:hAnsi="Times New Roman" w:cs="Times New Roman"/>
-          <w:color w:val="auto"/>
-          <w:sz w:val="16"/>
-          <w:szCs w:val="16"/>
-        </w:rPr>
-        <w:t xml:space="preserve"> </w:t>
-      </w:r>
-      <w:proofErr w:type="spellStart"/>
-      <w:r>
-        <w:rPr>
-          <w:rFonts w:ascii="Times New Roman" w:hAnsi="Times New Roman" w:cs="Times New Roman"/>
-          <w:color w:val="auto"/>
-          <w:sz w:val="16"/>
-          <w:szCs w:val="16"/>
-        </w:rPr>
-        <w:t>hatası</w:t>
-      </w:r>
-      <w:proofErr w:type="spellEnd"/>
+        <w:t xml:space="preserve"> Analysis Center</w:t>
+      </w:r>
     </w:p>
     <w:p>
       <w:r>
-        <w:t xml:space="preserve">G11 </w:t>
-      </w:r>
-      <w:proofErr w:type="spellStart"/>
-      <w:r>
-        <w:t>uydusuna</w:t>
-      </w:r>
-      <w:proofErr w:type="spellEnd"/>
-      <w:r>
-        <w:t xml:space="preserve"> </w:t>
-      </w:r>
-      <w:proofErr w:type="spellStart"/>
-      <w:r>
-        <w:t>ait</w:t>
-      </w:r>
-      <w:proofErr w:type="spellEnd"/>
-      <w:r>
-        <w:t xml:space="preserve"> </w:t>
-      </w:r>
-      <w:r>
-        <w:t>C</w:t>
-      </w:r>
-      <w:r>
-        <w:t>ODE</w:t>
-      </w:r>
-      <w:r>
-        <w:t xml:space="preserve"> </w:t>
-      </w:r>
-      <w:proofErr w:type="spellStart"/>
-      <w:r>
-        <w:t>analiz</w:t>
-      </w:r>
-      <w:proofErr w:type="spellEnd"/>
-      <w:r>
-        <w:t xml:space="preserve"> </w:t>
-      </w:r>
-      <w:proofErr w:type="spellStart"/>
-      <w:r>
-        <w:t>merkezenin</w:t>
-      </w:r>
-      <w:proofErr w:type="spellEnd"/>
-      <w:r>
-        <w:t xml:space="preserve"> </w:t>
-      </w:r>
-      <w:proofErr w:type="spellStart"/>
-      <w:r>
-        <w:t>farklı</w:t>
-      </w:r>
-      <w:proofErr w:type="spellEnd"/>
-      <w:r>
-        <w:t xml:space="preserve"> </w:t>
-      </w:r>
-      <w:proofErr w:type="spellStart"/>
-      <w:r>
-        <w:t>kestirim</w:t>
-      </w:r>
-      <w:proofErr w:type="spellEnd"/>
-      <w:r>
-        <w:t xml:space="preserve"> </w:t>
-      </w:r>
-      <w:proofErr w:type="spellStart"/>
-      <w:r>
-        <w:t>algoritmalarında</w:t>
-      </w:r>
-      <w:proofErr w:type="spellEnd"/>
-      <w:r>
-        <w:t xml:space="preserve"> LOO-CV 3D RMSE </w:t>
-      </w:r>
-      <w:proofErr w:type="spellStart"/>
-      <w:r>
-        <w:t>değerlerinin</w:t>
-      </w:r>
-      <w:proofErr w:type="spellEnd"/>
-      <w:r>
-        <w:t xml:space="preserve"> </w:t>
-      </w:r>
-      <w:proofErr w:type="spellStart"/>
-      <w:r>
-        <w:t>karşılaştırılması</w:t>
-      </w:r>
-      <w:proofErr w:type="spellEnd"/>
-      <w:r>
-        <w:t xml:space="preserve"> </w:t>
-      </w:r>
-      <w:proofErr w:type="spellStart"/>
-      <w:r>
-        <w:t>Şekil</w:t>
-      </w:r>
-      <w:proofErr w:type="spellEnd"/>
-      <w:r>
-        <w:t xml:space="preserve"> 5 de </w:t>
-      </w:r>
-      <w:proofErr w:type="spellStart"/>
-      <w:r>
-        <w:t>gösterilmiştir</w:t>
-      </w:r>
-      <w:proofErr w:type="spellEnd"/>
-      <w:r>
-        <w:t>.</w:t>
+        <w:t>The LOO-CV RMSE comparison (Figure 5) further confirms these findings. EKF and Lagrange provide the lowest error values, followed by RF and KNN, while SVR and MLP show considerably higher RMSE values.</w:t>
       </w:r>
     </w:p>
     <w:p>
@@ -10928,14 +11358,15 @@
       <w:r>
         <w:rPr>
           <w:rFonts w:ascii="Times New Roman" w:hAnsi="Times New Roman" w:cs="Times New Roman"/>
+          <w:noProof/>
           <w:color w:val="auto"/>
           <w:sz w:val="16"/>
           <w:szCs w:val="16"/>
         </w:rPr>
         <w:drawing>
-          <wp:inline distT="0" distB="0" distL="0" distR="0" wp14:anchorId="1949DCDD" wp14:editId="1F752DB6">
-            <wp:extent cx="3818873" cy="2273723"/>
-            <wp:effectExtent l="0" t="0" r="0" b="0"/>
+          <wp:inline distT="0" distB="0" distL="0" distR="0" wp14:anchorId="1949DCDD" wp14:editId="321D1D12">
+            <wp:extent cx="3363110" cy="2002366"/>
+            <wp:effectExtent l="0" t="0" r="8890" b="0"/>
             <wp:docPr id="551898447" name="Resim 3"/>
             <wp:cNvGraphicFramePr>
               <a:graphicFrameLocks xmlns:a="http://schemas.openxmlformats.org/drawingml/2006/main" noChangeAspect="1"/>
@@ -10962,7 +11393,7 @@
                   <pic:spPr>
                     <a:xfrm>
                       <a:off x="0" y="0"/>
-                      <a:ext cx="3826807" cy="2278447"/>
+                      <a:ext cx="3375930" cy="2009999"/>
                     </a:xfrm>
                     <a:prstGeom prst="rect">
                       <a:avLst/>
@@ -11025,6 +11456,7 @@
       <w:r>
         <w:rPr>
           <w:rFonts w:ascii="Times New Roman" w:hAnsi="Times New Roman" w:cs="Times New Roman"/>
+          <w:noProof/>
           <w:color w:val="auto"/>
           <w:sz w:val="16"/>
           <w:szCs w:val="16"/>
@@ -11060,618 +11492,1357 @@
         <w:rPr>
           <w:lang w:eastAsia="en-US"/>
         </w:rPr>
-        <w:t xml:space="preserve">CODE, GFZ </w:t>
+        <w:t>Since CODE, GFZ, and JAXA analysis centers were observed to produce highly consistent and comparable results across all GPS satellites, only the G11 satellite from the CODE dataset is presented in the graphical analyses to preserve clarity and conciseness. These visualizations effectively illustrate the positional performance of the estimation algorithms. Considering the orbital dynamics and the periodic nature of satellite motion along the ecliptic plane, the LOO-CV RMSE results reveal distinct performance differences among the methods. Specifically, RF, SVR, KNN, and MLP yield RMSE values of 500.3 km, 3338.2 km, 739.7 km, and 6073.8 km, respectively, whereas EKF achieves a significantly lower RMSE of 16.7 km.</w:t>
+      </w:r>
+      <w:r>
+        <w:rPr>
+          <w:lang w:eastAsia="en-US"/>
+        </w:rPr>
+        <w:t xml:space="preserve"> </w:t>
+      </w:r>
+    </w:p>
+    <w:p/>
+    <w:p>
+      <w:pPr>
+        <w:pStyle w:val="Balk3"/>
+        <w:rPr>
+          <w:lang w:val="en-US"/>
+        </w:rPr>
+      </w:pPr>
+      <w:r>
+        <w:rPr>
+          <w:lang w:val="en-US"/>
+        </w:rPr>
+        <w:t xml:space="preserve">900 second interval dataset </w:t>
       </w:r>
       <w:proofErr w:type="spellStart"/>
       <w:r>
         <w:rPr>
+          <w:lang w:val="en-US"/>
+        </w:rPr>
+        <w:t>performans</w:t>
+      </w:r>
+      <w:proofErr w:type="spellEnd"/>
+    </w:p>
+    <w:p>
+      <w:pPr>
+        <w:rPr>
+          <w:b/>
+          <w:bCs/>
+        </w:rPr>
+      </w:pPr>
+      <w:r>
+        <w:t>The one-day dataset with a 900-second sampling interval was generated by GRG and SHA. The estimation results for all satellites were evaluated using 3D position RMSE and are summarized in Table 3. It is observed that both analysis centers produce nearly identical results across all estimation algorithms. Compared to the 300-second dataset, a general increase in RMSE values is observed for all methods.</w:t>
+      </w:r>
+    </w:p>
+    <w:p>
+      <w:pPr>
+        <w:pStyle w:val="ResimYazs"/>
+        <w:jc w:val="center"/>
+        <w:rPr>
+          <w:rFonts w:ascii="Times New Roman" w:hAnsi="Times New Roman" w:cs="Times New Roman"/>
+          <w:color w:val="auto"/>
+          <w:sz w:val="16"/>
+          <w:szCs w:val="16"/>
+        </w:rPr>
+      </w:pPr>
+      <w:r>
+        <w:rPr>
+          <w:rFonts w:ascii="Times New Roman" w:hAnsi="Times New Roman" w:cs="Times New Roman"/>
+          <w:color w:val="auto"/>
+          <w:sz w:val="16"/>
+          <w:szCs w:val="16"/>
+        </w:rPr>
+        <w:t xml:space="preserve">Table </w:t>
+      </w:r>
+      <w:r>
+        <w:rPr>
+          <w:rFonts w:ascii="Times New Roman" w:hAnsi="Times New Roman" w:cs="Times New Roman"/>
+          <w:color w:val="auto"/>
+          <w:sz w:val="16"/>
+          <w:szCs w:val="16"/>
+        </w:rPr>
+        <w:fldChar w:fldCharType="begin"/>
+      </w:r>
+      <w:r>
+        <w:rPr>
+          <w:rFonts w:ascii="Times New Roman" w:hAnsi="Times New Roman" w:cs="Times New Roman"/>
+          <w:color w:val="auto"/>
+          <w:sz w:val="16"/>
+          <w:szCs w:val="16"/>
+        </w:rPr>
+        <w:instrText xml:space="preserve"> SEQ Table \* ARABIC </w:instrText>
+      </w:r>
+      <w:r>
+        <w:rPr>
+          <w:rFonts w:ascii="Times New Roman" w:hAnsi="Times New Roman" w:cs="Times New Roman"/>
+          <w:color w:val="auto"/>
+          <w:sz w:val="16"/>
+          <w:szCs w:val="16"/>
+        </w:rPr>
+        <w:fldChar w:fldCharType="separate"/>
+      </w:r>
+      <w:r>
+        <w:rPr>
+          <w:rFonts w:ascii="Times New Roman" w:hAnsi="Times New Roman" w:cs="Times New Roman"/>
+          <w:noProof/>
+          <w:color w:val="auto"/>
+          <w:sz w:val="16"/>
+          <w:szCs w:val="16"/>
+        </w:rPr>
+        <w:t>3</w:t>
+      </w:r>
+      <w:r>
+        <w:rPr>
+          <w:rFonts w:ascii="Times New Roman" w:hAnsi="Times New Roman" w:cs="Times New Roman"/>
+          <w:color w:val="auto"/>
+          <w:sz w:val="16"/>
+          <w:szCs w:val="16"/>
+        </w:rPr>
+        <w:fldChar w:fldCharType="end"/>
+      </w:r>
+      <w:proofErr w:type="gramStart"/>
+      <w:r>
+        <w:rPr>
+          <w:rFonts w:ascii="Times New Roman" w:hAnsi="Times New Roman" w:cs="Times New Roman"/>
+          <w:color w:val="auto"/>
+          <w:sz w:val="16"/>
+          <w:szCs w:val="16"/>
+        </w:rPr>
+        <w:t xml:space="preserve">: </w:t>
+      </w:r>
+      <w:r>
+        <w:rPr>
+          <w:rFonts w:ascii="Times New Roman" w:hAnsi="Times New Roman" w:cs="Times New Roman"/>
+          <w:color w:val="auto"/>
+        </w:rPr>
+        <w:t>:</w:t>
+      </w:r>
+      <w:proofErr w:type="gramEnd"/>
+      <w:r>
+        <w:rPr>
+          <w:rFonts w:ascii="Times New Roman" w:hAnsi="Times New Roman" w:cs="Times New Roman"/>
+          <w:color w:val="auto"/>
+        </w:rPr>
+        <w:t xml:space="preserve"> </w:t>
+      </w:r>
+      <w:r>
+        <w:rPr>
+          <w:rFonts w:ascii="Times New Roman" w:hAnsi="Times New Roman" w:cs="Times New Roman"/>
+          <w:color w:val="auto"/>
+          <w:sz w:val="16"/>
+          <w:szCs w:val="16"/>
+        </w:rPr>
+        <w:t>3D Position RMSE Comparison of Orbit Estimation Methods for 900-Second Interval Datasets</w:t>
+      </w:r>
+    </w:p>
+    <w:tbl>
+      <w:tblPr>
+        <w:tblStyle w:val="TabloKlavuzu"/>
+        <w:tblW w:w="0" w:type="auto"/>
+        <w:tblLook w:val="04A0" w:firstRow="1" w:lastRow="0" w:firstColumn="1" w:lastColumn="0" w:noHBand="0" w:noVBand="1"/>
+      </w:tblPr>
+      <w:tblGrid>
+        <w:gridCol w:w="2830"/>
+        <w:gridCol w:w="1134"/>
+        <w:gridCol w:w="1134"/>
+        <w:gridCol w:w="1134"/>
+        <w:gridCol w:w="1134"/>
+        <w:gridCol w:w="827"/>
+        <w:gridCol w:w="823"/>
+      </w:tblGrid>
+      <w:tr>
+        <w:tc>
+          <w:tcPr>
+            <w:tcW w:w="2830" w:type="dxa"/>
+          </w:tcPr>
+          <w:p>
+            <w:pPr>
+              <w:rPr>
+                <w:sz w:val="16"/>
+                <w:szCs w:val="16"/>
+              </w:rPr>
+            </w:pPr>
+            <w:r>
+              <w:rPr>
+                <w:sz w:val="16"/>
+                <w:szCs w:val="16"/>
+              </w:rPr>
+              <w:t>3D Position RMS (Satellite G11)</w:t>
+            </w:r>
+          </w:p>
+        </w:tc>
+        <w:tc>
+          <w:tcPr>
+            <w:tcW w:w="1134" w:type="dxa"/>
+          </w:tcPr>
+          <w:p>
+            <w:pPr>
+              <w:rPr>
+                <w:sz w:val="16"/>
+                <w:szCs w:val="16"/>
+              </w:rPr>
+            </w:pPr>
+            <w:r>
+              <w:rPr>
+                <w:sz w:val="16"/>
+                <w:szCs w:val="16"/>
+              </w:rPr>
+              <w:t>RF</w:t>
+            </w:r>
+          </w:p>
+        </w:tc>
+        <w:tc>
+          <w:tcPr>
+            <w:tcW w:w="1134" w:type="dxa"/>
+          </w:tcPr>
+          <w:p>
+            <w:pPr>
+              <w:rPr>
+                <w:sz w:val="16"/>
+                <w:szCs w:val="16"/>
+              </w:rPr>
+            </w:pPr>
+            <w:r>
+              <w:rPr>
+                <w:sz w:val="16"/>
+                <w:szCs w:val="16"/>
+              </w:rPr>
+              <w:t>SVR</w:t>
+            </w:r>
+          </w:p>
+        </w:tc>
+        <w:tc>
+          <w:tcPr>
+            <w:tcW w:w="1134" w:type="dxa"/>
+          </w:tcPr>
+          <w:p>
+            <w:pPr>
+              <w:rPr>
+                <w:sz w:val="16"/>
+                <w:szCs w:val="16"/>
+              </w:rPr>
+            </w:pPr>
+            <w:r>
+              <w:rPr>
+                <w:sz w:val="16"/>
+                <w:szCs w:val="16"/>
+              </w:rPr>
+              <w:t>KNN</w:t>
+            </w:r>
+          </w:p>
+        </w:tc>
+        <w:tc>
+          <w:tcPr>
+            <w:tcW w:w="1134" w:type="dxa"/>
+          </w:tcPr>
+          <w:p>
+            <w:pPr>
+              <w:rPr>
+                <w:sz w:val="16"/>
+                <w:szCs w:val="16"/>
+              </w:rPr>
+            </w:pPr>
+            <w:r>
+              <w:rPr>
+                <w:sz w:val="16"/>
+                <w:szCs w:val="16"/>
+              </w:rPr>
+              <w:t>MLP</w:t>
+            </w:r>
+          </w:p>
+        </w:tc>
+        <w:tc>
+          <w:tcPr>
+            <w:tcW w:w="827" w:type="dxa"/>
+          </w:tcPr>
+          <w:p>
+            <w:pPr>
+              <w:rPr>
+                <w:sz w:val="16"/>
+                <w:szCs w:val="16"/>
+              </w:rPr>
+            </w:pPr>
+            <w:r>
+              <w:rPr>
+                <w:sz w:val="16"/>
+                <w:szCs w:val="16"/>
+              </w:rPr>
+              <w:t>EKF</w:t>
+            </w:r>
+          </w:p>
+        </w:tc>
+        <w:tc>
+          <w:tcPr>
+            <w:tcW w:w="823" w:type="dxa"/>
+          </w:tcPr>
+          <w:p>
+            <w:pPr>
+              <w:rPr>
+                <w:sz w:val="16"/>
+                <w:szCs w:val="16"/>
+              </w:rPr>
+            </w:pPr>
+            <w:r>
+              <w:rPr>
+                <w:sz w:val="16"/>
+                <w:szCs w:val="16"/>
+              </w:rPr>
+              <w:t>Lagrange</w:t>
+            </w:r>
+          </w:p>
+        </w:tc>
+      </w:tr>
+      <w:tr>
+        <w:tc>
+          <w:tcPr>
+            <w:tcW w:w="2830" w:type="dxa"/>
+          </w:tcPr>
+          <w:p>
+            <w:pPr>
+              <w:rPr>
+                <w:sz w:val="16"/>
+                <w:szCs w:val="16"/>
+              </w:rPr>
+            </w:pPr>
+            <w:r>
+              <w:rPr>
+                <w:sz w:val="16"/>
+                <w:szCs w:val="16"/>
+              </w:rPr>
+              <w:t>GRG</w:t>
+            </w:r>
+          </w:p>
+        </w:tc>
+        <w:tc>
+          <w:tcPr>
+            <w:tcW w:w="1134" w:type="dxa"/>
+          </w:tcPr>
+          <w:p>
+            <w:pPr>
+              <w:rPr>
+                <w:sz w:val="16"/>
+                <w:szCs w:val="16"/>
+              </w:rPr>
+            </w:pPr>
+            <w:r>
+              <w:rPr>
+                <w:sz w:val="16"/>
+                <w:szCs w:val="16"/>
+              </w:rPr>
+              <w:t>540763.11</w:t>
+            </w:r>
+            <w:r>
+              <w:rPr>
+                <w:sz w:val="16"/>
+                <w:szCs w:val="16"/>
+              </w:rPr>
+              <w:t xml:space="preserve"> m</w:t>
+            </w:r>
+          </w:p>
+        </w:tc>
+        <w:tc>
+          <w:tcPr>
+            <w:tcW w:w="1134" w:type="dxa"/>
+          </w:tcPr>
+          <w:p>
+            <w:pPr>
+              <w:rPr>
+                <w:sz w:val="16"/>
+                <w:szCs w:val="16"/>
+              </w:rPr>
+            </w:pPr>
+            <w:r>
+              <w:rPr>
+                <w:sz w:val="16"/>
+                <w:szCs w:val="16"/>
+              </w:rPr>
+              <w:t>4155725.76</w:t>
+            </w:r>
+            <w:r>
+              <w:rPr>
+                <w:sz w:val="16"/>
+                <w:szCs w:val="16"/>
+              </w:rPr>
+              <w:t xml:space="preserve"> m</w:t>
+            </w:r>
+          </w:p>
+        </w:tc>
+        <w:tc>
+          <w:tcPr>
+            <w:tcW w:w="1134" w:type="dxa"/>
+          </w:tcPr>
+          <w:p>
+            <w:pPr>
+              <w:rPr>
+                <w:sz w:val="16"/>
+                <w:szCs w:val="16"/>
+              </w:rPr>
+            </w:pPr>
+            <w:r>
+              <w:rPr>
+                <w:sz w:val="16"/>
+                <w:szCs w:val="16"/>
+              </w:rPr>
+              <w:t>2009342.42</w:t>
+            </w:r>
+            <w:r>
+              <w:rPr>
+                <w:sz w:val="16"/>
+                <w:szCs w:val="16"/>
+              </w:rPr>
+              <w:t xml:space="preserve"> m</w:t>
+            </w:r>
+          </w:p>
+        </w:tc>
+        <w:tc>
+          <w:tcPr>
+            <w:tcW w:w="1134" w:type="dxa"/>
+          </w:tcPr>
+          <w:p>
+            <w:pPr>
+              <w:rPr>
+                <w:sz w:val="16"/>
+                <w:szCs w:val="16"/>
+              </w:rPr>
+            </w:pPr>
+            <w:r>
+              <w:rPr>
+                <w:sz w:val="16"/>
+                <w:szCs w:val="16"/>
+              </w:rPr>
+              <w:t>6577248,66</w:t>
+            </w:r>
+            <w:r>
+              <w:rPr>
+                <w:sz w:val="16"/>
+                <w:szCs w:val="16"/>
+              </w:rPr>
+              <w:t xml:space="preserve"> m</w:t>
+            </w:r>
+          </w:p>
+        </w:tc>
+        <w:tc>
+          <w:tcPr>
+            <w:tcW w:w="827" w:type="dxa"/>
+          </w:tcPr>
+          <w:p>
+            <w:pPr>
+              <w:rPr>
+                <w:sz w:val="16"/>
+                <w:szCs w:val="16"/>
+              </w:rPr>
+            </w:pPr>
+            <w:r>
+              <w:rPr>
+                <w:sz w:val="16"/>
+                <w:szCs w:val="16"/>
+              </w:rPr>
+              <w:t>255.12</w:t>
+            </w:r>
+            <w:r>
+              <w:rPr>
+                <w:sz w:val="16"/>
+                <w:szCs w:val="16"/>
+              </w:rPr>
+              <w:t xml:space="preserve"> m</w:t>
+            </w:r>
+          </w:p>
+        </w:tc>
+        <w:tc>
+          <w:tcPr>
+            <w:tcW w:w="823" w:type="dxa"/>
+          </w:tcPr>
+          <w:p>
+            <w:pPr>
+              <w:rPr>
+                <w:sz w:val="16"/>
+                <w:szCs w:val="16"/>
+              </w:rPr>
+            </w:pPr>
+            <w:r>
+              <w:rPr>
+                <w:sz w:val="16"/>
+                <w:szCs w:val="16"/>
+              </w:rPr>
+              <w:t>187.17</w:t>
+            </w:r>
+            <w:r>
+              <w:rPr>
+                <w:sz w:val="16"/>
+                <w:szCs w:val="16"/>
+              </w:rPr>
+              <w:t xml:space="preserve"> m</w:t>
+            </w:r>
+          </w:p>
+        </w:tc>
+      </w:tr>
+      <w:tr>
+        <w:tc>
+          <w:tcPr>
+            <w:tcW w:w="2830" w:type="dxa"/>
+          </w:tcPr>
+          <w:p>
+            <w:pPr>
+              <w:rPr>
+                <w:sz w:val="16"/>
+                <w:szCs w:val="16"/>
+              </w:rPr>
+            </w:pPr>
+            <w:r>
+              <w:rPr>
+                <w:sz w:val="16"/>
+                <w:szCs w:val="16"/>
+              </w:rPr>
+              <w:t>SHA</w:t>
+            </w:r>
+          </w:p>
+        </w:tc>
+        <w:tc>
+          <w:tcPr>
+            <w:tcW w:w="1134" w:type="dxa"/>
+          </w:tcPr>
+          <w:p>
+            <w:pPr>
+              <w:rPr>
+                <w:sz w:val="16"/>
+                <w:szCs w:val="16"/>
+              </w:rPr>
+            </w:pPr>
+            <w:r>
+              <w:rPr>
+                <w:sz w:val="16"/>
+                <w:szCs w:val="16"/>
+              </w:rPr>
+              <w:t>540763 m</w:t>
+            </w:r>
+          </w:p>
+        </w:tc>
+        <w:tc>
+          <w:tcPr>
+            <w:tcW w:w="1134" w:type="dxa"/>
+          </w:tcPr>
+          <w:p>
+            <w:pPr>
+              <w:rPr>
+                <w:sz w:val="16"/>
+                <w:szCs w:val="16"/>
+              </w:rPr>
+            </w:pPr>
+            <w:r>
+              <w:rPr>
+                <w:sz w:val="16"/>
+                <w:szCs w:val="16"/>
+              </w:rPr>
+              <w:t>4156055 m</w:t>
+            </w:r>
+          </w:p>
+        </w:tc>
+        <w:tc>
+          <w:tcPr>
+            <w:tcW w:w="1134" w:type="dxa"/>
+          </w:tcPr>
+          <w:p>
+            <w:pPr>
+              <w:rPr>
+                <w:sz w:val="16"/>
+                <w:szCs w:val="16"/>
+              </w:rPr>
+            </w:pPr>
+            <w:r>
+              <w:rPr>
+                <w:sz w:val="16"/>
+                <w:szCs w:val="16"/>
+              </w:rPr>
+              <w:t>2009342 m</w:t>
+            </w:r>
+          </w:p>
+        </w:tc>
+        <w:tc>
+          <w:tcPr>
+            <w:tcW w:w="1134" w:type="dxa"/>
+          </w:tcPr>
+          <w:p>
+            <w:pPr>
+              <w:rPr>
+                <w:sz w:val="16"/>
+                <w:szCs w:val="16"/>
+              </w:rPr>
+            </w:pPr>
+            <w:r>
+              <w:rPr>
+                <w:sz w:val="16"/>
+                <w:szCs w:val="16"/>
+              </w:rPr>
+              <w:t>6577249 m</w:t>
+            </w:r>
+          </w:p>
+        </w:tc>
+        <w:tc>
+          <w:tcPr>
+            <w:tcW w:w="827" w:type="dxa"/>
+          </w:tcPr>
+          <w:p>
+            <w:pPr>
+              <w:rPr>
+                <w:sz w:val="16"/>
+                <w:szCs w:val="16"/>
+              </w:rPr>
+            </w:pPr>
+            <w:r>
+              <w:rPr>
+                <w:sz w:val="16"/>
+                <w:szCs w:val="16"/>
+              </w:rPr>
+              <w:t>255 m</w:t>
+            </w:r>
+          </w:p>
+        </w:tc>
+        <w:tc>
+          <w:tcPr>
+            <w:tcW w:w="823" w:type="dxa"/>
+          </w:tcPr>
+          <w:p>
+            <w:pPr>
+              <w:rPr>
+                <w:sz w:val="16"/>
+                <w:szCs w:val="16"/>
+              </w:rPr>
+            </w:pPr>
+            <w:r>
+              <w:rPr>
+                <w:sz w:val="16"/>
+                <w:szCs w:val="16"/>
+              </w:rPr>
+              <w:t>187 m</w:t>
+            </w:r>
+          </w:p>
+        </w:tc>
+      </w:tr>
+    </w:tbl>
+    <w:p>
+      <w:pPr>
+        <w:spacing w:before="120"/>
+      </w:pPr>
+      <w:r>
+        <w:t>According to Table 3, EKF and Lagrange again achieve the lowest RMSE values (approximately 255 m and 187 m, respectively), although with increased errors compared to the higher-rate dataset. RF and KNN show moderate degradation, while SVR and MLP produce substantially higher errors, reaching several thousand kilometers.</w:t>
+      </w:r>
+      <w:r>
+        <w:t xml:space="preserve"> </w:t>
+      </w:r>
+      <w:r>
+        <w:t>Due to the similarity between GRG and SHA results, the graphical analyses are presented using the GRG dataset. The orbit comparison results (Figure 6) demonstrate that EKF and Lagrange maintain close agreement with the reference orbit, although slight degradations are observed compared to the 300-second case. Other methods exhibit more pronounced deviations.</w:t>
+      </w:r>
+    </w:p>
+    <w:p>
+      <w:pPr>
+        <w:keepNext/>
+        <w:jc w:val="center"/>
+      </w:pPr>
+      <w:r>
+        <w:rPr>
+          <w:noProof/>
+        </w:rPr>
+        <w:drawing>
+          <wp:inline distT="0" distB="0" distL="0" distR="0" wp14:anchorId="219817F4" wp14:editId="54BB579E">
+            <wp:extent cx="3951647" cy="2174588"/>
+            <wp:effectExtent l="0" t="0" r="0" b="0"/>
+            <wp:docPr id="552312283" name="Resim 2"/>
+            <wp:cNvGraphicFramePr>
+              <a:graphicFrameLocks xmlns:a="http://schemas.openxmlformats.org/drawingml/2006/main" noChangeAspect="1"/>
+            </wp:cNvGraphicFramePr>
+            <a:graphic xmlns:a="http://schemas.openxmlformats.org/drawingml/2006/main">
+              <a:graphicData uri="http://schemas.openxmlformats.org/drawingml/2006/picture">
+                <pic:pic xmlns:pic="http://schemas.openxmlformats.org/drawingml/2006/picture">
+                  <pic:nvPicPr>
+                    <pic:cNvPr id="552312283" name="Resim 552312283"/>
+                    <pic:cNvPicPr/>
+                  </pic:nvPicPr>
+                  <pic:blipFill>
+                    <a:blip r:embed="rId13" cstate="print">
+                      <a:extLst>
+                        <a:ext uri="{28A0092B-C50C-407E-A947-70E740481C1C}">
+                          <a14:useLocalDpi xmlns:a14="http://schemas.microsoft.com/office/drawing/2010/main" val="0"/>
+                        </a:ext>
+                      </a:extLst>
+                    </a:blip>
+                    <a:stretch>
+                      <a:fillRect/>
+                    </a:stretch>
+                  </pic:blipFill>
+                  <pic:spPr>
+                    <a:xfrm>
+                      <a:off x="0" y="0"/>
+                      <a:ext cx="3961025" cy="2179749"/>
+                    </a:xfrm>
+                    <a:prstGeom prst="rect">
+                      <a:avLst/>
+                    </a:prstGeom>
+                  </pic:spPr>
+                </pic:pic>
+              </a:graphicData>
+            </a:graphic>
+          </wp:inline>
+        </w:drawing>
+      </w:r>
+    </w:p>
+    <w:p>
+      <w:pPr>
+        <w:pStyle w:val="ResimYazs"/>
+        <w:jc w:val="center"/>
+        <w:rPr>
+          <w:rFonts w:ascii="Times New Roman" w:hAnsi="Times New Roman" w:cs="Times New Roman"/>
+          <w:color w:val="auto"/>
+          <w:sz w:val="16"/>
+          <w:szCs w:val="16"/>
+        </w:rPr>
+      </w:pPr>
+      <w:r>
+        <w:rPr>
+          <w:rFonts w:ascii="Times New Roman" w:hAnsi="Times New Roman" w:cs="Times New Roman"/>
+          <w:color w:val="auto"/>
+          <w:sz w:val="16"/>
+          <w:szCs w:val="16"/>
+        </w:rPr>
+        <w:t xml:space="preserve">Figure </w:t>
+      </w:r>
+      <w:r>
+        <w:rPr>
+          <w:rFonts w:ascii="Times New Roman" w:hAnsi="Times New Roman" w:cs="Times New Roman"/>
+          <w:color w:val="auto"/>
+          <w:sz w:val="16"/>
+          <w:szCs w:val="16"/>
+        </w:rPr>
+        <w:fldChar w:fldCharType="begin"/>
+      </w:r>
+      <w:r>
+        <w:rPr>
+          <w:rFonts w:ascii="Times New Roman" w:hAnsi="Times New Roman" w:cs="Times New Roman"/>
+          <w:color w:val="auto"/>
+          <w:sz w:val="16"/>
+          <w:szCs w:val="16"/>
+        </w:rPr>
+        <w:instrText xml:space="preserve"> SEQ Figure \* ARABIC </w:instrText>
+      </w:r>
+      <w:r>
+        <w:rPr>
+          <w:rFonts w:ascii="Times New Roman" w:hAnsi="Times New Roman" w:cs="Times New Roman"/>
+          <w:color w:val="auto"/>
+          <w:sz w:val="16"/>
+          <w:szCs w:val="16"/>
+        </w:rPr>
+        <w:fldChar w:fldCharType="separate"/>
+      </w:r>
+      <w:r>
+        <w:rPr>
+          <w:rFonts w:ascii="Times New Roman" w:hAnsi="Times New Roman" w:cs="Times New Roman"/>
+          <w:noProof/>
+          <w:color w:val="auto"/>
+          <w:sz w:val="16"/>
+          <w:szCs w:val="16"/>
+        </w:rPr>
+        <w:t>6</w:t>
+      </w:r>
+      <w:r>
+        <w:rPr>
+          <w:rFonts w:ascii="Times New Roman" w:hAnsi="Times New Roman" w:cs="Times New Roman"/>
+          <w:color w:val="auto"/>
+          <w:sz w:val="16"/>
+          <w:szCs w:val="16"/>
+        </w:rPr>
+        <w:fldChar w:fldCharType="end"/>
+      </w:r>
+      <w:r>
+        <w:rPr>
+          <w:rFonts w:ascii="Times New Roman" w:hAnsi="Times New Roman" w:cs="Times New Roman"/>
+          <w:color w:val="auto"/>
+          <w:sz w:val="16"/>
+          <w:szCs w:val="16"/>
+        </w:rPr>
+        <w:t xml:space="preserve">: </w:t>
+      </w:r>
+      <w:r>
+        <w:rPr>
+          <w:rFonts w:ascii="Times New Roman" w:hAnsi="Times New Roman" w:cs="Times New Roman"/>
+          <w:color w:val="auto"/>
+          <w:sz w:val="16"/>
+          <w:szCs w:val="16"/>
+        </w:rPr>
+        <w:t>Orbit Estimation Performance for the GRG Analysis Center</w:t>
+      </w:r>
+    </w:p>
+    <w:p>
+      <w:r>
+        <w:t>The model-based 3D position errors (Figure 7) reveal an overall increase in error magnitude for all methods. EKF and Lagrange maintain relatively stable error behavior, whereas RF shows increased variability. SVR, KNN, and MLP produce significantly larger and more irregular errors.</w:t>
+      </w:r>
+    </w:p>
+    <w:p>
+      <w:pPr>
+        <w:keepNext/>
+        <w:jc w:val="center"/>
+      </w:pPr>
+      <w:r>
+        <w:rPr>
+          <w:noProof/>
+        </w:rPr>
+        <w:drawing>
+          <wp:inline distT="0" distB="0" distL="0" distR="0" wp14:anchorId="031FEF91" wp14:editId="6607CFCA">
+            <wp:extent cx="3440278" cy="1706033"/>
+            <wp:effectExtent l="0" t="0" r="8255" b="8890"/>
+            <wp:docPr id="1397695936" name="Resim 3"/>
+            <wp:cNvGraphicFramePr>
+              <a:graphicFrameLocks xmlns:a="http://schemas.openxmlformats.org/drawingml/2006/main" noChangeAspect="1"/>
+            </wp:cNvGraphicFramePr>
+            <a:graphic xmlns:a="http://schemas.openxmlformats.org/drawingml/2006/main">
+              <a:graphicData uri="http://schemas.openxmlformats.org/drawingml/2006/picture">
+                <pic:pic xmlns:pic="http://schemas.openxmlformats.org/drawingml/2006/picture">
+                  <pic:nvPicPr>
+                    <pic:cNvPr id="1397695936" name="Resim 1397695936"/>
+                    <pic:cNvPicPr/>
+                  </pic:nvPicPr>
+                  <pic:blipFill>
+                    <a:blip r:embed="rId14" cstate="print">
+                      <a:extLst>
+                        <a:ext uri="{28A0092B-C50C-407E-A947-70E740481C1C}">
+                          <a14:useLocalDpi xmlns:a14="http://schemas.microsoft.com/office/drawing/2010/main" val="0"/>
+                        </a:ext>
+                      </a:extLst>
+                    </a:blip>
+                    <a:stretch>
+                      <a:fillRect/>
+                    </a:stretch>
+                  </pic:blipFill>
+                  <pic:spPr>
+                    <a:xfrm>
+                      <a:off x="0" y="0"/>
+                      <a:ext cx="3461683" cy="1716648"/>
+                    </a:xfrm>
+                    <a:prstGeom prst="rect">
+                      <a:avLst/>
+                    </a:prstGeom>
+                  </pic:spPr>
+                </pic:pic>
+              </a:graphicData>
+            </a:graphic>
+          </wp:inline>
+        </w:drawing>
+      </w:r>
+    </w:p>
+    <w:p>
+      <w:pPr>
+        <w:pStyle w:val="ResimYazs"/>
+        <w:jc w:val="center"/>
+        <w:rPr>
+          <w:rFonts w:ascii="Times New Roman" w:hAnsi="Times New Roman" w:cs="Times New Roman"/>
+          <w:color w:val="auto"/>
+          <w:sz w:val="16"/>
+          <w:szCs w:val="16"/>
+        </w:rPr>
+      </w:pPr>
+      <w:r>
+        <w:rPr>
+          <w:rFonts w:ascii="Times New Roman" w:hAnsi="Times New Roman" w:cs="Times New Roman"/>
+          <w:color w:val="auto"/>
+          <w:sz w:val="16"/>
+          <w:szCs w:val="16"/>
+        </w:rPr>
+        <w:t xml:space="preserve">Figure </w:t>
+      </w:r>
+      <w:r>
+        <w:rPr>
+          <w:rFonts w:ascii="Times New Roman" w:hAnsi="Times New Roman" w:cs="Times New Roman"/>
+          <w:color w:val="auto"/>
+          <w:sz w:val="16"/>
+          <w:szCs w:val="16"/>
+        </w:rPr>
+        <w:fldChar w:fldCharType="begin"/>
+      </w:r>
+      <w:r>
+        <w:rPr>
+          <w:rFonts w:ascii="Times New Roman" w:hAnsi="Times New Roman" w:cs="Times New Roman"/>
+          <w:color w:val="auto"/>
+          <w:sz w:val="16"/>
+          <w:szCs w:val="16"/>
+        </w:rPr>
+        <w:instrText xml:space="preserve"> SEQ Figure \* ARABIC </w:instrText>
+      </w:r>
+      <w:r>
+        <w:rPr>
+          <w:rFonts w:ascii="Times New Roman" w:hAnsi="Times New Roman" w:cs="Times New Roman"/>
+          <w:color w:val="auto"/>
+          <w:sz w:val="16"/>
+          <w:szCs w:val="16"/>
+        </w:rPr>
+        <w:fldChar w:fldCharType="separate"/>
+      </w:r>
+      <w:r>
+        <w:rPr>
+          <w:rFonts w:ascii="Times New Roman" w:hAnsi="Times New Roman" w:cs="Times New Roman"/>
+          <w:noProof/>
+          <w:color w:val="auto"/>
+          <w:sz w:val="16"/>
+          <w:szCs w:val="16"/>
+        </w:rPr>
+        <w:t>7</w:t>
+      </w:r>
+      <w:r>
+        <w:rPr>
+          <w:rFonts w:ascii="Times New Roman" w:hAnsi="Times New Roman" w:cs="Times New Roman"/>
+          <w:color w:val="auto"/>
+          <w:sz w:val="16"/>
+          <w:szCs w:val="16"/>
+        </w:rPr>
+        <w:fldChar w:fldCharType="end"/>
+      </w:r>
+      <w:r>
+        <w:rPr>
+          <w:rFonts w:ascii="Times New Roman" w:hAnsi="Times New Roman" w:cs="Times New Roman"/>
+          <w:color w:val="auto"/>
+          <w:sz w:val="16"/>
+          <w:szCs w:val="16"/>
+        </w:rPr>
+        <w:t xml:space="preserve">: </w:t>
+      </w:r>
+      <w:r>
+        <w:rPr>
+          <w:rFonts w:ascii="Times New Roman" w:hAnsi="Times New Roman" w:cs="Times New Roman"/>
+          <w:color w:val="auto"/>
+          <w:sz w:val="16"/>
+          <w:szCs w:val="16"/>
+        </w:rPr>
+        <w:t>Model-Based 3D Position Error (LOO-CV) for GRG Analysis Center</w:t>
+      </w:r>
+    </w:p>
+    <w:p>
+      <w:r>
+        <w:t xml:space="preserve">The LOO-CV RMSE comparison (Figure 8) confirms that all methods experience performance degradation at lower temporal resolution. Nevertheless, EKF and Lagrange remain the </w:t>
+      </w:r>
+      <w:proofErr w:type="gramStart"/>
+      <w:r>
+        <w:t>best-performing</w:t>
+      </w:r>
+      <w:proofErr w:type="gramEnd"/>
+      <w:r>
+        <w:t xml:space="preserve"> approaches, followed by RF and KNN, while SVR and MLP exhibit the highest error levels.</w:t>
+      </w:r>
+    </w:p>
+    <w:p>
+      <w:pPr>
+        <w:keepNext/>
+        <w:jc w:val="center"/>
+      </w:pPr>
+      <w:r>
+        <w:rPr>
+          <w:noProof/>
+        </w:rPr>
+        <w:lastRenderedPageBreak/>
+        <w:drawing>
+          <wp:inline distT="0" distB="0" distL="0" distR="0" wp14:anchorId="100C618B" wp14:editId="38BA8186">
+            <wp:extent cx="3057375" cy="1820333"/>
+            <wp:effectExtent l="0" t="0" r="0" b="8890"/>
+            <wp:docPr id="1531367470" name="Resim 4"/>
+            <wp:cNvGraphicFramePr>
+              <a:graphicFrameLocks xmlns:a="http://schemas.openxmlformats.org/drawingml/2006/main" noChangeAspect="1"/>
+            </wp:cNvGraphicFramePr>
+            <a:graphic xmlns:a="http://schemas.openxmlformats.org/drawingml/2006/main">
+              <a:graphicData uri="http://schemas.openxmlformats.org/drawingml/2006/picture">
+                <pic:pic xmlns:pic="http://schemas.openxmlformats.org/drawingml/2006/picture">
+                  <pic:nvPicPr>
+                    <pic:cNvPr id="1531367470" name="Resim 1531367470"/>
+                    <pic:cNvPicPr/>
+                  </pic:nvPicPr>
+                  <pic:blipFill>
+                    <a:blip r:embed="rId15" cstate="print">
+                      <a:extLst>
+                        <a:ext uri="{28A0092B-C50C-407E-A947-70E740481C1C}">
+                          <a14:useLocalDpi xmlns:a14="http://schemas.microsoft.com/office/drawing/2010/main" val="0"/>
+                        </a:ext>
+                      </a:extLst>
+                    </a:blip>
+                    <a:stretch>
+                      <a:fillRect/>
+                    </a:stretch>
+                  </pic:blipFill>
+                  <pic:spPr>
+                    <a:xfrm>
+                      <a:off x="0" y="0"/>
+                      <a:ext cx="3072548" cy="1829367"/>
+                    </a:xfrm>
+                    <a:prstGeom prst="rect">
+                      <a:avLst/>
+                    </a:prstGeom>
+                  </pic:spPr>
+                </pic:pic>
+              </a:graphicData>
+            </a:graphic>
+          </wp:inline>
+        </w:drawing>
+      </w:r>
+    </w:p>
+    <w:p>
+      <w:pPr>
+        <w:pStyle w:val="ResimYazs"/>
+        <w:jc w:val="center"/>
+        <w:rPr>
+          <w:rFonts w:ascii="Times New Roman" w:hAnsi="Times New Roman" w:cs="Times New Roman"/>
+          <w:color w:val="auto"/>
+          <w:sz w:val="16"/>
+          <w:szCs w:val="16"/>
+        </w:rPr>
+      </w:pPr>
+      <w:r>
+        <w:rPr>
+          <w:rFonts w:ascii="Times New Roman" w:hAnsi="Times New Roman" w:cs="Times New Roman"/>
+          <w:color w:val="auto"/>
+          <w:sz w:val="16"/>
+          <w:szCs w:val="16"/>
+        </w:rPr>
+        <w:t xml:space="preserve">Figure </w:t>
+      </w:r>
+      <w:r>
+        <w:rPr>
+          <w:rFonts w:ascii="Times New Roman" w:hAnsi="Times New Roman" w:cs="Times New Roman"/>
+          <w:color w:val="auto"/>
+          <w:sz w:val="16"/>
+          <w:szCs w:val="16"/>
+        </w:rPr>
+        <w:fldChar w:fldCharType="begin"/>
+      </w:r>
+      <w:r>
+        <w:rPr>
+          <w:rFonts w:ascii="Times New Roman" w:hAnsi="Times New Roman" w:cs="Times New Roman"/>
+          <w:color w:val="auto"/>
+          <w:sz w:val="16"/>
+          <w:szCs w:val="16"/>
+        </w:rPr>
+        <w:instrText xml:space="preserve"> SEQ Figure \* ARABIC </w:instrText>
+      </w:r>
+      <w:r>
+        <w:rPr>
+          <w:rFonts w:ascii="Times New Roman" w:hAnsi="Times New Roman" w:cs="Times New Roman"/>
+          <w:color w:val="auto"/>
+          <w:sz w:val="16"/>
+          <w:szCs w:val="16"/>
+        </w:rPr>
+        <w:fldChar w:fldCharType="separate"/>
+      </w:r>
+      <w:r>
+        <w:rPr>
+          <w:rFonts w:ascii="Times New Roman" w:hAnsi="Times New Roman" w:cs="Times New Roman"/>
+          <w:color w:val="auto"/>
+          <w:sz w:val="16"/>
+          <w:szCs w:val="16"/>
+        </w:rPr>
+        <w:t>8</w:t>
+      </w:r>
+      <w:r>
+        <w:rPr>
+          <w:rFonts w:ascii="Times New Roman" w:hAnsi="Times New Roman" w:cs="Times New Roman"/>
+          <w:color w:val="auto"/>
+          <w:sz w:val="16"/>
+          <w:szCs w:val="16"/>
+        </w:rPr>
+        <w:fldChar w:fldCharType="end"/>
+      </w:r>
+      <w:r>
+        <w:rPr>
+          <w:rFonts w:ascii="Times New Roman" w:hAnsi="Times New Roman" w:cs="Times New Roman"/>
+          <w:color w:val="auto"/>
+          <w:sz w:val="16"/>
+          <w:szCs w:val="16"/>
+        </w:rPr>
+        <w:t xml:space="preserve">: </w:t>
+      </w:r>
+      <w:r>
+        <w:rPr>
+          <w:rFonts w:ascii="Times New Roman" w:hAnsi="Times New Roman" w:cs="Times New Roman"/>
+          <w:color w:val="auto"/>
+          <w:sz w:val="16"/>
+          <w:szCs w:val="16"/>
+        </w:rPr>
+        <w:t>LOO-CV-Based 3D RMSE Comparison for GRG Analysis Center</w:t>
+      </w:r>
+    </w:p>
+    <w:p/>
+    <w:p>
+      <w:pPr>
+        <w:pStyle w:val="Balk3"/>
+        <w:rPr>
+          <w:lang w:val="en-US"/>
+        </w:rPr>
+      </w:pPr>
+      <w:r>
+        <w:rPr>
+          <w:lang w:val="en-US"/>
+        </w:rPr>
+        <w:t>Comparison of analysis centers</w:t>
+      </w:r>
+    </w:p>
+    <w:p>
+      <w:pPr>
+        <w:rPr>
           <w:lang w:eastAsia="en-US"/>
         </w:rPr>
-        <w:t>ve</w:t>
+      </w:pPr>
+      <w:r>
+        <w:rPr>
+          <w:lang w:eastAsia="en-US"/>
+        </w:rPr>
+        <w:t>The comparison across analysis centers is presented in Figure 9 based on EKF results. It is observed that CODE, GFZ, and JAXA yield nearly identical RMSE values, indicating consistent performance for the 300-second datasets. In contrast, GRG and SHA exhibit significantly higher RMSE values corresponding to the 900-second datasets.</w:t>
+      </w:r>
+    </w:p>
+    <w:p>
+      <w:pPr>
+        <w:rPr>
+          <w:lang w:eastAsia="en-US"/>
+        </w:rPr>
+      </w:pPr>
+      <w:r>
+        <w:rPr>
+          <w:lang w:eastAsia="en-US"/>
+        </w:rPr>
+        <w:t>These results indicate that estimation accuracy is primarily influenced by the temporal resolution of the datasets, while differences between analysis centers remain negligible when similar sampling intervals are used.</w:t>
+      </w:r>
+    </w:p>
+    <w:p>
+      <w:pPr>
+        <w:keepNext/>
+        <w:jc w:val="center"/>
+      </w:pPr>
+      <w:r>
+        <w:rPr>
+          <w:noProof/>
+          <w:lang w:eastAsia="en-US"/>
+        </w:rPr>
+        <w:drawing>
+          <wp:inline distT="0" distB="0" distL="0" distR="0" wp14:anchorId="5C41B480" wp14:editId="5FB68AAF">
+            <wp:extent cx="3506294" cy="2087228"/>
+            <wp:effectExtent l="0" t="0" r="0" b="8890"/>
+            <wp:docPr id="459354894" name="Resim 1"/>
+            <wp:cNvGraphicFramePr>
+              <a:graphicFrameLocks xmlns:a="http://schemas.openxmlformats.org/drawingml/2006/main" noChangeAspect="1"/>
+            </wp:cNvGraphicFramePr>
+            <a:graphic xmlns:a="http://schemas.openxmlformats.org/drawingml/2006/main">
+              <a:graphicData uri="http://schemas.openxmlformats.org/drawingml/2006/picture">
+                <pic:pic xmlns:pic="http://schemas.openxmlformats.org/drawingml/2006/picture">
+                  <pic:nvPicPr>
+                    <pic:cNvPr id="459354894" name="Resim 459354894"/>
+                    <pic:cNvPicPr/>
+                  </pic:nvPicPr>
+                  <pic:blipFill>
+                    <a:blip r:embed="rId16" cstate="print">
+                      <a:extLst>
+                        <a:ext uri="{28A0092B-C50C-407E-A947-70E740481C1C}">
+                          <a14:useLocalDpi xmlns:a14="http://schemas.microsoft.com/office/drawing/2010/main" val="0"/>
+                        </a:ext>
+                      </a:extLst>
+                    </a:blip>
+                    <a:stretch>
+                      <a:fillRect/>
+                    </a:stretch>
+                  </pic:blipFill>
+                  <pic:spPr>
+                    <a:xfrm>
+                      <a:off x="0" y="0"/>
+                      <a:ext cx="3513029" cy="2091237"/>
+                    </a:xfrm>
+                    <a:prstGeom prst="rect">
+                      <a:avLst/>
+                    </a:prstGeom>
+                  </pic:spPr>
+                </pic:pic>
+              </a:graphicData>
+            </a:graphic>
+          </wp:inline>
+        </w:drawing>
+      </w:r>
+    </w:p>
+    <w:p>
+      <w:pPr>
+        <w:pStyle w:val="ResimYazs"/>
+        <w:jc w:val="center"/>
+        <w:rPr>
+          <w:rFonts w:ascii="Times New Roman" w:hAnsi="Times New Roman" w:cs="Times New Roman"/>
+          <w:color w:val="auto"/>
+          <w:sz w:val="16"/>
+          <w:szCs w:val="16"/>
+        </w:rPr>
+      </w:pPr>
+      <w:r>
+        <w:rPr>
+          <w:rFonts w:ascii="Times New Roman" w:hAnsi="Times New Roman" w:cs="Times New Roman"/>
+          <w:color w:val="auto"/>
+          <w:sz w:val="16"/>
+          <w:szCs w:val="16"/>
+        </w:rPr>
+        <w:t xml:space="preserve">Figure </w:t>
+      </w:r>
+      <w:r>
+        <w:rPr>
+          <w:rFonts w:ascii="Times New Roman" w:hAnsi="Times New Roman" w:cs="Times New Roman"/>
+          <w:color w:val="auto"/>
+          <w:sz w:val="16"/>
+          <w:szCs w:val="16"/>
+        </w:rPr>
+        <w:fldChar w:fldCharType="begin"/>
+      </w:r>
+      <w:r>
+        <w:rPr>
+          <w:rFonts w:ascii="Times New Roman" w:hAnsi="Times New Roman" w:cs="Times New Roman"/>
+          <w:color w:val="auto"/>
+          <w:sz w:val="16"/>
+          <w:szCs w:val="16"/>
+        </w:rPr>
+        <w:instrText xml:space="preserve"> SEQ Figure \* ARABIC </w:instrText>
+      </w:r>
+      <w:r>
+        <w:rPr>
+          <w:rFonts w:ascii="Times New Roman" w:hAnsi="Times New Roman" w:cs="Times New Roman"/>
+          <w:color w:val="auto"/>
+          <w:sz w:val="16"/>
+          <w:szCs w:val="16"/>
+        </w:rPr>
+        <w:fldChar w:fldCharType="separate"/>
+      </w:r>
+      <w:r>
+        <w:rPr>
+          <w:rFonts w:ascii="Times New Roman" w:hAnsi="Times New Roman" w:cs="Times New Roman"/>
+          <w:noProof/>
+          <w:color w:val="auto"/>
+          <w:sz w:val="16"/>
+          <w:szCs w:val="16"/>
+        </w:rPr>
+        <w:t>9</w:t>
+      </w:r>
+      <w:r>
+        <w:rPr>
+          <w:rFonts w:ascii="Times New Roman" w:hAnsi="Times New Roman" w:cs="Times New Roman"/>
+          <w:color w:val="auto"/>
+          <w:sz w:val="16"/>
+          <w:szCs w:val="16"/>
+        </w:rPr>
+        <w:fldChar w:fldCharType="end"/>
+      </w:r>
+      <w:r>
+        <w:rPr>
+          <w:rFonts w:ascii="Times New Roman" w:hAnsi="Times New Roman" w:cs="Times New Roman"/>
+          <w:color w:val="auto"/>
+          <w:sz w:val="16"/>
+          <w:szCs w:val="16"/>
+        </w:rPr>
+        <w:t xml:space="preserve">: EKF </w:t>
+      </w:r>
+      <w:proofErr w:type="spellStart"/>
+      <w:r>
+        <w:rPr>
+          <w:rFonts w:ascii="Times New Roman" w:hAnsi="Times New Roman" w:cs="Times New Roman"/>
+          <w:color w:val="auto"/>
+          <w:sz w:val="16"/>
+          <w:szCs w:val="16"/>
+        </w:rPr>
+        <w:t>analzi</w:t>
       </w:r>
       <w:proofErr w:type="spellEnd"/>
       <w:r>
         <w:rPr>
-          <w:lang w:eastAsia="en-US"/>
-        </w:rPr>
-        <w:t xml:space="preserve"> JAXA </w:t>
+          <w:rFonts w:ascii="Times New Roman" w:hAnsi="Times New Roman" w:cs="Times New Roman"/>
+          <w:color w:val="auto"/>
+          <w:sz w:val="16"/>
+          <w:szCs w:val="16"/>
+        </w:rPr>
+        <w:t xml:space="preserve"> </w:t>
       </w:r>
       <w:proofErr w:type="spellStart"/>
       <w:r>
         <w:rPr>
-          <w:lang w:eastAsia="en-US"/>
-        </w:rPr>
-        <w:t>analiz</w:t>
+          <w:rFonts w:ascii="Times New Roman" w:hAnsi="Times New Roman" w:cs="Times New Roman"/>
+          <w:color w:val="auto"/>
+          <w:sz w:val="16"/>
+          <w:szCs w:val="16"/>
+        </w:rPr>
+        <w:t>merkezlerine</w:t>
       </w:r>
       <w:proofErr w:type="spellEnd"/>
       <w:r>
         <w:rPr>
-          <w:lang w:eastAsia="en-US"/>
+          <w:rFonts w:ascii="Times New Roman" w:hAnsi="Times New Roman" w:cs="Times New Roman"/>
+          <w:color w:val="auto"/>
+          <w:sz w:val="16"/>
+          <w:szCs w:val="16"/>
         </w:rPr>
         <w:t xml:space="preserve"> </w:t>
       </w:r>
       <w:proofErr w:type="spellStart"/>
       <w:r>
         <w:rPr>
-          <w:lang w:eastAsia="en-US"/>
-        </w:rPr>
-        <w:t>merkezlerinin</w:t>
+          <w:rFonts w:ascii="Times New Roman" w:hAnsi="Times New Roman" w:cs="Times New Roman"/>
+          <w:color w:val="auto"/>
+          <w:sz w:val="16"/>
+          <w:szCs w:val="16"/>
+        </w:rPr>
+        <w:t>göre</w:t>
       </w:r>
       <w:proofErr w:type="spellEnd"/>
       <w:r>
         <w:rPr>
-          <w:lang w:eastAsia="en-US"/>
-        </w:rPr>
-        <w:t xml:space="preserve"> GPS </w:t>
+          <w:rFonts w:ascii="Times New Roman" w:hAnsi="Times New Roman" w:cs="Times New Roman"/>
+          <w:color w:val="auto"/>
+          <w:sz w:val="16"/>
+          <w:szCs w:val="16"/>
+        </w:rPr>
+        <w:t xml:space="preserve"> LOO-CV </w:t>
       </w:r>
       <w:proofErr w:type="spellStart"/>
       <w:r>
         <w:rPr>
-          <w:lang w:eastAsia="en-US"/>
-        </w:rPr>
-        <w:t>uydu</w:t>
+          <w:rFonts w:ascii="Times New Roman" w:hAnsi="Times New Roman" w:cs="Times New Roman"/>
+          <w:color w:val="auto"/>
+          <w:sz w:val="16"/>
+          <w:szCs w:val="16"/>
+        </w:rPr>
+        <w:t>üzerinden</w:t>
       </w:r>
       <w:proofErr w:type="spellEnd"/>
       <w:r>
         <w:rPr>
-          <w:lang w:eastAsia="en-US"/>
+          <w:rFonts w:ascii="Times New Roman" w:hAnsi="Times New Roman" w:cs="Times New Roman"/>
+          <w:color w:val="auto"/>
+          <w:sz w:val="16"/>
+          <w:szCs w:val="16"/>
         </w:rPr>
         <w:t xml:space="preserve"> </w:t>
       </w:r>
       <w:proofErr w:type="spellStart"/>
       <w:r>
         <w:rPr>
-          <w:lang w:eastAsia="en-US"/>
-        </w:rPr>
-        <w:t>tak</w:t>
-      </w:r>
-      <w:r>
-        <w:rPr>
-          <w:lang w:eastAsia="en-US"/>
-        </w:rPr>
-        <w:t>ımlarının</w:t>
+          <w:rFonts w:ascii="Times New Roman" w:hAnsi="Times New Roman" w:cs="Times New Roman"/>
+          <w:color w:val="auto"/>
+          <w:sz w:val="16"/>
+          <w:szCs w:val="16"/>
+        </w:rPr>
+        <w:t>karşılaştırma</w:t>
       </w:r>
       <w:proofErr w:type="spellEnd"/>
       <w:r>
         <w:rPr>
-          <w:lang w:eastAsia="en-US"/>
+          <w:rFonts w:ascii="Times New Roman" w:hAnsi="Times New Roman" w:cs="Times New Roman"/>
+          <w:color w:val="auto"/>
+          <w:sz w:val="16"/>
+          <w:szCs w:val="16"/>
         </w:rPr>
         <w:t xml:space="preserve"> </w:t>
       </w:r>
       <w:proofErr w:type="spellStart"/>
       <w:r>
         <w:rPr>
-          <w:lang w:eastAsia="en-US"/>
-        </w:rPr>
-        <w:t>hepsi</w:t>
+          <w:rFonts w:ascii="Times New Roman" w:hAnsi="Times New Roman" w:cs="Times New Roman"/>
+          <w:color w:val="auto"/>
+          <w:sz w:val="16"/>
+          <w:szCs w:val="16"/>
+        </w:rPr>
+        <w:t>performansı</w:t>
       </w:r>
       <w:proofErr w:type="spellEnd"/>
-      <w:r>
-        <w:rPr>
-          <w:lang w:eastAsia="en-US"/>
-        </w:rPr>
-        <w:t xml:space="preserve"> </w:t>
-      </w:r>
-      <w:proofErr w:type="spellStart"/>
-      <w:r>
-        <w:rPr>
-          <w:lang w:eastAsia="en-US"/>
-        </w:rPr>
-        <w:t>için</w:t>
-      </w:r>
-      <w:proofErr w:type="spellEnd"/>
-      <w:r>
-        <w:rPr>
-          <w:lang w:eastAsia="en-US"/>
-        </w:rPr>
-        <w:t xml:space="preserve"> </w:t>
-      </w:r>
-      <w:proofErr w:type="spellStart"/>
-      <w:r>
-        <w:rPr>
-          <w:lang w:eastAsia="en-US"/>
-        </w:rPr>
-        <w:t>çok</w:t>
-      </w:r>
-      <w:proofErr w:type="spellEnd"/>
-      <w:r>
-        <w:rPr>
-          <w:lang w:eastAsia="en-US"/>
-        </w:rPr>
-        <w:t xml:space="preserve"> </w:t>
-      </w:r>
-      <w:proofErr w:type="spellStart"/>
-      <w:r>
-        <w:rPr>
-          <w:lang w:eastAsia="en-US"/>
-        </w:rPr>
-        <w:t>yakın-benzer</w:t>
-      </w:r>
-      <w:proofErr w:type="spellEnd"/>
-      <w:r>
-        <w:rPr>
-          <w:lang w:eastAsia="en-US"/>
-        </w:rPr>
-        <w:t xml:space="preserve"> </w:t>
-      </w:r>
-      <w:proofErr w:type="spellStart"/>
-      <w:r>
-        <w:rPr>
-          <w:lang w:eastAsia="en-US"/>
-        </w:rPr>
-        <w:t>sonuçlar</w:t>
-      </w:r>
-      <w:proofErr w:type="spellEnd"/>
-      <w:r>
-        <w:rPr>
-          <w:lang w:eastAsia="en-US"/>
-        </w:rPr>
-        <w:t xml:space="preserve"> </w:t>
-      </w:r>
-      <w:proofErr w:type="spellStart"/>
-      <w:r>
-        <w:rPr>
-          <w:lang w:eastAsia="en-US"/>
-        </w:rPr>
-        <w:t>verdiği</w:t>
-      </w:r>
-      <w:proofErr w:type="spellEnd"/>
-      <w:r>
-        <w:rPr>
-          <w:lang w:eastAsia="en-US"/>
-        </w:rPr>
-        <w:t xml:space="preserve"> </w:t>
-      </w:r>
-      <w:proofErr w:type="spellStart"/>
-      <w:r>
-        <w:rPr>
-          <w:lang w:eastAsia="en-US"/>
-        </w:rPr>
-        <w:t>görüldüğü</w:t>
-      </w:r>
-      <w:proofErr w:type="spellEnd"/>
-      <w:r>
-        <w:rPr>
-          <w:lang w:eastAsia="en-US"/>
-        </w:rPr>
-        <w:t xml:space="preserve"> </w:t>
-      </w:r>
-      <w:proofErr w:type="spellStart"/>
-      <w:r>
-        <w:rPr>
-          <w:lang w:eastAsia="en-US"/>
-        </w:rPr>
-        <w:t>için</w:t>
-      </w:r>
-      <w:proofErr w:type="spellEnd"/>
-      <w:r>
-        <w:rPr>
-          <w:lang w:eastAsia="en-US"/>
-        </w:rPr>
-        <w:t xml:space="preserve"> </w:t>
-      </w:r>
-      <w:proofErr w:type="spellStart"/>
-      <w:r>
-        <w:rPr>
-          <w:lang w:eastAsia="en-US"/>
-        </w:rPr>
-        <w:t>anlatım</w:t>
-      </w:r>
-      <w:proofErr w:type="spellEnd"/>
-      <w:r>
-        <w:rPr>
-          <w:lang w:eastAsia="en-US"/>
-        </w:rPr>
-        <w:t xml:space="preserve"> </w:t>
-      </w:r>
-      <w:proofErr w:type="spellStart"/>
-      <w:r>
-        <w:rPr>
-          <w:lang w:eastAsia="en-US"/>
-        </w:rPr>
-        <w:t>sadeliğini</w:t>
-      </w:r>
-      <w:proofErr w:type="spellEnd"/>
-      <w:r>
-        <w:rPr>
-          <w:lang w:eastAsia="en-US"/>
-        </w:rPr>
-        <w:t xml:space="preserve"> </w:t>
-      </w:r>
-      <w:proofErr w:type="spellStart"/>
-      <w:r>
-        <w:rPr>
-          <w:lang w:eastAsia="en-US"/>
-        </w:rPr>
-        <w:t>bozmamak</w:t>
-      </w:r>
-      <w:proofErr w:type="spellEnd"/>
-      <w:r>
-        <w:rPr>
-          <w:lang w:eastAsia="en-US"/>
-        </w:rPr>
-        <w:t xml:space="preserve"> </w:t>
-      </w:r>
-      <w:proofErr w:type="spellStart"/>
-      <w:r>
-        <w:rPr>
-          <w:lang w:eastAsia="en-US"/>
-        </w:rPr>
-        <w:t>adına</w:t>
-      </w:r>
-      <w:proofErr w:type="spellEnd"/>
-      <w:r>
-        <w:rPr>
-          <w:lang w:eastAsia="en-US"/>
-        </w:rPr>
-        <w:t xml:space="preserve"> </w:t>
-      </w:r>
-      <w:proofErr w:type="spellStart"/>
-      <w:r>
-        <w:rPr>
-          <w:lang w:eastAsia="en-US"/>
-        </w:rPr>
-        <w:t>grafiklerde</w:t>
-      </w:r>
-      <w:proofErr w:type="spellEnd"/>
-      <w:r>
-        <w:rPr>
-          <w:lang w:eastAsia="en-US"/>
-        </w:rPr>
-        <w:t xml:space="preserve"> </w:t>
-      </w:r>
-      <w:proofErr w:type="spellStart"/>
-      <w:proofErr w:type="gramStart"/>
-      <w:r>
-        <w:rPr>
-          <w:lang w:eastAsia="en-US"/>
-        </w:rPr>
-        <w:t>sadece</w:t>
-      </w:r>
-      <w:proofErr w:type="spellEnd"/>
-      <w:r>
-        <w:rPr>
-          <w:lang w:eastAsia="en-US"/>
-        </w:rPr>
-        <w:t xml:space="preserve">  CODE</w:t>
-      </w:r>
-      <w:proofErr w:type="gramEnd"/>
-      <w:r>
-        <w:rPr>
-          <w:lang w:eastAsia="en-US"/>
-        </w:rPr>
-        <w:t xml:space="preserve"> G11 </w:t>
-      </w:r>
-      <w:proofErr w:type="spellStart"/>
-      <w:r>
-        <w:rPr>
-          <w:lang w:eastAsia="en-US"/>
-        </w:rPr>
-        <w:t>uydu</w:t>
-      </w:r>
-      <w:proofErr w:type="spellEnd"/>
-      <w:r>
-        <w:rPr>
-          <w:lang w:eastAsia="en-US"/>
-        </w:rPr>
-        <w:t xml:space="preserve"> </w:t>
-      </w:r>
-      <w:proofErr w:type="spellStart"/>
-      <w:r>
-        <w:rPr>
-          <w:lang w:eastAsia="en-US"/>
-        </w:rPr>
-        <w:t>takımı</w:t>
-      </w:r>
-      <w:proofErr w:type="spellEnd"/>
-      <w:r>
-        <w:rPr>
-          <w:lang w:eastAsia="en-US"/>
-        </w:rPr>
-        <w:t xml:space="preserve"> </w:t>
-      </w:r>
-      <w:proofErr w:type="spellStart"/>
-      <w:r>
-        <w:rPr>
-          <w:lang w:eastAsia="en-US"/>
-        </w:rPr>
-        <w:t>için</w:t>
-      </w:r>
-      <w:proofErr w:type="spellEnd"/>
-      <w:r>
-        <w:rPr>
-          <w:lang w:eastAsia="en-US"/>
-        </w:rPr>
-        <w:t xml:space="preserve"> </w:t>
-      </w:r>
-      <w:proofErr w:type="spellStart"/>
-      <w:r>
-        <w:rPr>
-          <w:lang w:eastAsia="en-US"/>
-        </w:rPr>
-        <w:t>gösterilmiştir</w:t>
-      </w:r>
-      <w:proofErr w:type="spellEnd"/>
-      <w:r>
-        <w:rPr>
-          <w:lang w:eastAsia="en-US"/>
-        </w:rPr>
-        <w:t xml:space="preserve">. </w:t>
-      </w:r>
-      <w:proofErr w:type="spellStart"/>
-      <w:r>
-        <w:rPr>
-          <w:lang w:eastAsia="en-US"/>
-        </w:rPr>
-        <w:t>Söz</w:t>
-      </w:r>
-      <w:proofErr w:type="spellEnd"/>
-      <w:r>
-        <w:rPr>
-          <w:lang w:eastAsia="en-US"/>
-        </w:rPr>
-        <w:t xml:space="preserve"> </w:t>
-      </w:r>
-      <w:proofErr w:type="spellStart"/>
-      <w:r>
-        <w:rPr>
-          <w:lang w:eastAsia="en-US"/>
-        </w:rPr>
-        <w:t>konusu</w:t>
-      </w:r>
-      <w:proofErr w:type="spellEnd"/>
-      <w:r>
-        <w:rPr>
-          <w:lang w:eastAsia="en-US"/>
-        </w:rPr>
-        <w:t xml:space="preserve"> </w:t>
-      </w:r>
-      <w:proofErr w:type="spellStart"/>
-      <w:r>
-        <w:rPr>
-          <w:lang w:eastAsia="en-US"/>
-        </w:rPr>
-        <w:t>grafikler</w:t>
-      </w:r>
-      <w:proofErr w:type="spellEnd"/>
-      <w:r>
-        <w:rPr>
-          <w:lang w:eastAsia="en-US"/>
-        </w:rPr>
-        <w:t xml:space="preserve"> </w:t>
-      </w:r>
-      <w:proofErr w:type="spellStart"/>
-      <w:r>
-        <w:rPr>
-          <w:lang w:eastAsia="en-US"/>
-        </w:rPr>
-        <w:t>kestirim</w:t>
-      </w:r>
-      <w:proofErr w:type="spellEnd"/>
-      <w:r>
-        <w:rPr>
-          <w:lang w:eastAsia="en-US"/>
-        </w:rPr>
-        <w:t xml:space="preserve"> </w:t>
-      </w:r>
-      <w:proofErr w:type="spellStart"/>
-      <w:r>
-        <w:rPr>
-          <w:lang w:eastAsia="en-US"/>
-        </w:rPr>
-        <w:t>algoritmalarının</w:t>
-      </w:r>
-      <w:proofErr w:type="spellEnd"/>
-      <w:r>
-        <w:rPr>
-          <w:lang w:eastAsia="en-US"/>
-        </w:rPr>
-        <w:t xml:space="preserve"> </w:t>
-      </w:r>
-      <w:proofErr w:type="spellStart"/>
-      <w:r>
-        <w:rPr>
-          <w:lang w:eastAsia="en-US"/>
-        </w:rPr>
-        <w:t>konumsal</w:t>
-      </w:r>
-      <w:proofErr w:type="spellEnd"/>
-      <w:r>
-        <w:rPr>
-          <w:lang w:eastAsia="en-US"/>
-        </w:rPr>
-        <w:t xml:space="preserve"> </w:t>
-      </w:r>
-      <w:proofErr w:type="spellStart"/>
-      <w:r>
-        <w:rPr>
-          <w:lang w:eastAsia="en-US"/>
-        </w:rPr>
-        <w:t>başarılarını</w:t>
-      </w:r>
-      <w:proofErr w:type="spellEnd"/>
-      <w:r>
-        <w:rPr>
-          <w:lang w:eastAsia="en-US"/>
-        </w:rPr>
-        <w:t xml:space="preserve"> </w:t>
-      </w:r>
-      <w:proofErr w:type="spellStart"/>
-      <w:r>
-        <w:rPr>
-          <w:lang w:eastAsia="en-US"/>
-        </w:rPr>
-        <w:t>ortaya</w:t>
-      </w:r>
-      <w:proofErr w:type="spellEnd"/>
-      <w:r>
-        <w:rPr>
-          <w:lang w:eastAsia="en-US"/>
-        </w:rPr>
-        <w:t xml:space="preserve"> </w:t>
-      </w:r>
-      <w:proofErr w:type="spellStart"/>
-      <w:r>
-        <w:rPr>
-          <w:lang w:eastAsia="en-US"/>
-        </w:rPr>
-        <w:t>koyabilmiştir</w:t>
-      </w:r>
-      <w:proofErr w:type="spellEnd"/>
-      <w:r>
-        <w:rPr>
-          <w:lang w:eastAsia="en-US"/>
-        </w:rPr>
-        <w:t xml:space="preserve">. </w:t>
-      </w:r>
-      <w:proofErr w:type="spellStart"/>
-      <w:r>
-        <w:rPr>
-          <w:lang w:eastAsia="en-US"/>
-        </w:rPr>
-        <w:t>Uydunun</w:t>
-      </w:r>
-      <w:proofErr w:type="spellEnd"/>
-      <w:r>
-        <w:rPr>
-          <w:lang w:eastAsia="en-US"/>
-        </w:rPr>
-        <w:t xml:space="preserve"> </w:t>
-      </w:r>
-      <w:proofErr w:type="spellStart"/>
-      <w:r>
-        <w:rPr>
-          <w:lang w:eastAsia="en-US"/>
-        </w:rPr>
-        <w:t>ekliptik</w:t>
-      </w:r>
-      <w:proofErr w:type="spellEnd"/>
-      <w:r>
-        <w:rPr>
-          <w:lang w:eastAsia="en-US"/>
-        </w:rPr>
-        <w:t xml:space="preserve"> </w:t>
-      </w:r>
-      <w:proofErr w:type="spellStart"/>
-      <w:r>
-        <w:rPr>
-          <w:lang w:eastAsia="en-US"/>
-        </w:rPr>
-        <w:t>hareketi</w:t>
-      </w:r>
-      <w:proofErr w:type="spellEnd"/>
-      <w:r>
-        <w:rPr>
-          <w:lang w:eastAsia="en-US"/>
-        </w:rPr>
-        <w:t xml:space="preserve"> </w:t>
-      </w:r>
-      <w:proofErr w:type="spellStart"/>
-      <w:r>
-        <w:rPr>
-          <w:lang w:eastAsia="en-US"/>
-        </w:rPr>
-        <w:t>göz</w:t>
-      </w:r>
-      <w:proofErr w:type="spellEnd"/>
-      <w:r>
-        <w:rPr>
-          <w:lang w:eastAsia="en-US"/>
-        </w:rPr>
-        <w:t xml:space="preserve"> </w:t>
-      </w:r>
-      <w:proofErr w:type="spellStart"/>
-      <w:r>
-        <w:rPr>
-          <w:lang w:eastAsia="en-US"/>
-        </w:rPr>
-        <w:t>önüne</w:t>
-      </w:r>
-      <w:proofErr w:type="spellEnd"/>
-      <w:r>
-        <w:rPr>
-          <w:lang w:eastAsia="en-US"/>
-        </w:rPr>
-        <w:t xml:space="preserve"> </w:t>
-      </w:r>
-      <w:proofErr w:type="spellStart"/>
-      <w:proofErr w:type="gramStart"/>
-      <w:r>
-        <w:rPr>
-          <w:lang w:eastAsia="en-US"/>
-        </w:rPr>
-        <w:t>alındığında</w:t>
-      </w:r>
-      <w:proofErr w:type="spellEnd"/>
-      <w:r>
-        <w:rPr>
-          <w:lang w:eastAsia="en-US"/>
-        </w:rPr>
-        <w:t xml:space="preserve">  LOO</w:t>
-      </w:r>
-      <w:proofErr w:type="gramEnd"/>
-      <w:r>
-        <w:rPr>
-          <w:lang w:eastAsia="en-US"/>
-        </w:rPr>
-        <w:t xml:space="preserve">-CV RMSE </w:t>
-      </w:r>
-      <w:proofErr w:type="spellStart"/>
-      <w:r>
-        <w:rPr>
-          <w:lang w:eastAsia="en-US"/>
-        </w:rPr>
-        <w:t>kiteri</w:t>
-      </w:r>
-      <w:proofErr w:type="spellEnd"/>
-      <w:r>
-        <w:rPr>
-          <w:lang w:eastAsia="en-US"/>
-        </w:rPr>
-        <w:t xml:space="preserve"> </w:t>
-      </w:r>
-      <w:proofErr w:type="spellStart"/>
-      <w:r>
-        <w:rPr>
-          <w:lang w:eastAsia="en-US"/>
-        </w:rPr>
-        <w:t>üzerinden</w:t>
-      </w:r>
-      <w:proofErr w:type="spellEnd"/>
-      <w:r>
-        <w:rPr>
-          <w:lang w:eastAsia="en-US"/>
-        </w:rPr>
-        <w:t xml:space="preserve"> RF 500.3 km, SVR 337.2 km, KNN 739.7 km, MLP 6073.8 km, EKF 16.7 km </w:t>
-      </w:r>
-      <w:proofErr w:type="spellStart"/>
-      <w:r>
-        <w:rPr>
-          <w:lang w:eastAsia="en-US"/>
-        </w:rPr>
-        <w:t>değerleri</w:t>
-      </w:r>
-      <w:proofErr w:type="spellEnd"/>
-      <w:r>
-        <w:rPr>
-          <w:lang w:eastAsia="en-US"/>
-        </w:rPr>
-        <w:t xml:space="preserve"> </w:t>
-      </w:r>
-      <w:proofErr w:type="spellStart"/>
-      <w:r>
-        <w:rPr>
-          <w:lang w:eastAsia="en-US"/>
-        </w:rPr>
-        <w:t>üretilmiştir</w:t>
-      </w:r>
-      <w:proofErr w:type="spellEnd"/>
-      <w:r>
-        <w:rPr>
-          <w:lang w:eastAsia="en-US"/>
-        </w:rPr>
-        <w:t xml:space="preserve">. </w:t>
-      </w:r>
     </w:p>
     <w:p/>
     <w:p>
@@ -11758,6 +12929,7 @@
           <w:bCs/>
           <w:lang w:val="en-US"/>
         </w:rPr>
+        <w:lastRenderedPageBreak/>
         <w:t>Albuquerque, P. K. de, Kuroswiski, A. R., Wu, A. S., Santos, W. G. dos, &amp; Costa, P. (2025). Orbit Determination through Cosmic Microwave Background Radiation. </w:t>
       </w:r>
       <w:proofErr w:type="spellStart"/>
@@ -11787,7 +12959,7 @@
         </w:rPr>
         <w:t>. </w:t>
       </w:r>
-      <w:hyperlink r:id="rId13" w:tgtFrame="_blank" w:history="1">
+      <w:hyperlink r:id="rId17" w:tgtFrame="_blank" w:history="1">
         <w:r>
           <w:rPr>
             <w:rStyle w:val="Kpr"/>
@@ -12005,7 +13177,7 @@
         </w:rPr>
         <w:t>, 100-106. </w:t>
       </w:r>
-      <w:hyperlink r:id="rId14" w:history="1">
+      <w:hyperlink r:id="rId18" w:history="1">
         <w:r>
           <w:rPr>
             <w:rStyle w:val="Kpr"/>
@@ -12090,7 +13262,7 @@
         </w:rPr>
         <w:t xml:space="preserve">(3), 104. </w:t>
       </w:r>
-      <w:hyperlink r:id="rId15" w:history="1">
+      <w:hyperlink r:id="rId19" w:history="1">
         <w:r>
           <w:rPr>
             <w:rStyle w:val="Kpr"/>
@@ -12368,7 +13540,7 @@
         </w:rPr>
         <w:t>(1), 30-44. </w:t>
       </w:r>
-      <w:hyperlink r:id="rId16" w:tgtFrame="_blank" w:history="1">
+      <w:hyperlink r:id="rId20" w:tgtFrame="_blank" w:history="1">
         <w:r>
           <w:rPr>
             <w:rStyle w:val="Kpr"/>
@@ -12446,7 +13618,7 @@
         </w:rPr>
         <w:t xml:space="preserve">(2). </w:t>
       </w:r>
-      <w:hyperlink r:id="rId17" w:history="1">
+      <w:hyperlink r:id="rId21" w:history="1">
         <w:r>
           <w:rPr>
             <w:rStyle w:val="Kpr"/>
@@ -12508,7 +13680,7 @@
         </w:rPr>
         <w:t xml:space="preserve">(12), 7970. </w:t>
       </w:r>
-      <w:hyperlink r:id="rId18" w:history="1">
+      <w:hyperlink r:id="rId22" w:history="1">
         <w:r>
           <w:rPr>
             <w:rStyle w:val="Kpr"/>
@@ -12579,7 +13751,7 @@
         </w:rPr>
         <w:t>(1). </w:t>
       </w:r>
-      <w:hyperlink r:id="rId19" w:tgtFrame="_blank" w:history="1">
+      <w:hyperlink r:id="rId23" w:tgtFrame="_blank" w:history="1">
         <w:r>
           <w:rPr>
             <w:rStyle w:val="Kpr"/>
@@ -12655,7 +13827,7 @@
         </w:rPr>
         <w:t xml:space="preserve">. </w:t>
       </w:r>
-      <w:hyperlink r:id="rId20" w:history="1">
+      <w:hyperlink r:id="rId24" w:history="1">
         <w:r>
           <w:rPr>
             <w:rStyle w:val="Kpr"/>
@@ -12717,7 +13889,7 @@
         </w:rPr>
         <w:t xml:space="preserve">(10). </w:t>
       </w:r>
-      <w:hyperlink r:id="rId21" w:history="1">
+      <w:hyperlink r:id="rId25" w:history="1">
         <w:r>
           <w:rPr>
             <w:rStyle w:val="Kpr"/>
@@ -12926,7 +14098,7 @@
         </w:rPr>
         <w:t xml:space="preserve"> Media. </w:t>
       </w:r>
-      <w:hyperlink r:id="rId22" w:tgtFrame="_blank" w:history="1">
+      <w:hyperlink r:id="rId26" w:tgtFrame="_blank" w:history="1">
         <w:r>
           <w:rPr>
             <w:rStyle w:val="Kpr"/>
@@ -12995,7 +14167,7 @@
         </w:rPr>
         <w:t xml:space="preserve">(6), 37. </w:t>
       </w:r>
-      <w:hyperlink r:id="rId23" w:history="1">
+      <w:hyperlink r:id="rId27" w:history="1">
         <w:r>
           <w:rPr>
             <w:rStyle w:val="Kpr"/>
@@ -13022,7 +14194,6 @@
           <w:bCs/>
           <w:lang w:val="en-US"/>
         </w:rPr>
-        <w:lastRenderedPageBreak/>
         <w:t xml:space="preserve">Hutton, J. J., Gopaul, N., Zhang, X., Wang, J., Menon, V., Rieck, D., Kipka, A., &amp; Pastor, F. (2016). CENTIMETER-LEVEL, ROBUST GNSS-AIDED INERTIAL POST-PROCESSING FOR MOBILE MAPPING WITHOUT LOCAL REFERENCE STATIONS. </w:t>
       </w:r>
       <w:r>
@@ -13041,7 +14212,7 @@
         </w:rPr>
         <w:t xml:space="preserve">, 819. </w:t>
       </w:r>
-      <w:hyperlink r:id="rId24" w:history="1">
+      <w:hyperlink r:id="rId28" w:history="1">
         <w:r>
           <w:rPr>
             <w:rStyle w:val="Kpr"/>
@@ -13102,7 +14273,7 @@
         </w:rPr>
         <w:t>(18), 11517. </w:t>
       </w:r>
-      <w:hyperlink r:id="rId25" w:tgtFrame="_blank" w:history="1">
+      <w:hyperlink r:id="rId29" w:tgtFrame="_blank" w:history="1">
         <w:r>
           <w:rPr>
             <w:rStyle w:val="Kpr"/>
@@ -13166,7 +14337,7 @@
         </w:rPr>
         <w:t xml:space="preserve"> 18, 139 (2025). </w:t>
       </w:r>
-      <w:hyperlink r:id="rId26" w:history="1">
+      <w:hyperlink r:id="rId30" w:history="1">
         <w:r>
           <w:rPr>
             <w:rStyle w:val="Kpr"/>
@@ -13242,7 +14413,7 @@
         </w:rPr>
         <w:t xml:space="preserve">, 55(1), 235–240. </w:t>
       </w:r>
-      <w:hyperlink r:id="rId27" w:history="1">
+      <w:hyperlink r:id="rId31" w:history="1">
         <w:r>
           <w:rPr>
             <w:rStyle w:val="Kpr"/>
@@ -13297,7 +14468,7 @@
         </w:rPr>
         <w:t>. </w:t>
       </w:r>
-      <w:hyperlink r:id="rId28" w:tgtFrame="_blank" w:history="1">
+      <w:hyperlink r:id="rId32" w:tgtFrame="_blank" w:history="1">
         <w:r>
           <w:rPr>
             <w:rStyle w:val="Kpr"/>
@@ -13324,6 +14495,7 @@
           <w:bCs/>
           <w:lang w:val="en-US"/>
         </w:rPr>
+        <w:lastRenderedPageBreak/>
         <w:t xml:space="preserve">Lou, Y., Dai, X., Gong, X., Li, C., Qing, Y., Liu, Y., Peng, Y., &amp; Gu, S. (2022). A review of real-time </w:t>
       </w:r>
       <w:r>
@@ -13442,7 +14614,7 @@
         </w:rPr>
         <w:t xml:space="preserve">(1). Springer Nature. </w:t>
       </w:r>
-      <w:hyperlink r:id="rId29" w:history="1">
+      <w:hyperlink r:id="rId33" w:history="1">
         <w:r>
           <w:rPr>
             <w:rStyle w:val="Kpr"/>
@@ -13515,7 +14687,7 @@
         </w:rPr>
         <w:t xml:space="preserve">(6). </w:t>
       </w:r>
-      <w:hyperlink r:id="rId30" w:history="1">
+      <w:hyperlink r:id="rId34" w:history="1">
         <w:r>
           <w:rPr>
             <w:rStyle w:val="Kpr"/>
@@ -13592,7 +14764,7 @@
         </w:rPr>
         <w:t xml:space="preserve">, 95. </w:t>
       </w:r>
-      <w:hyperlink r:id="rId31" w:history="1">
+      <w:hyperlink r:id="rId35" w:history="1">
         <w:r>
           <w:rPr>
             <w:rStyle w:val="Kpr"/>
@@ -13668,7 +14840,7 @@
         </w:rPr>
         <w:t>(9). </w:t>
       </w:r>
-      <w:hyperlink r:id="rId32" w:tgtFrame="_blank" w:history="1">
+      <w:hyperlink r:id="rId36" w:tgtFrame="_blank" w:history="1">
         <w:r>
           <w:rPr>
             <w:rStyle w:val="Kpr"/>
@@ -13730,7 +14902,7 @@
         </w:rPr>
         <w:t xml:space="preserve">(1). </w:t>
       </w:r>
-      <w:hyperlink r:id="rId33" w:history="1">
+      <w:hyperlink r:id="rId37" w:history="1">
         <w:r>
           <w:rPr>
             <w:rStyle w:val="Kpr"/>
@@ -13792,7 +14964,7 @@
         </w:rPr>
         <w:t xml:space="preserve">(2). </w:t>
       </w:r>
-      <w:hyperlink r:id="rId34" w:history="1">
+      <w:hyperlink r:id="rId38" w:history="1">
         <w:r>
           <w:rPr>
             <w:rStyle w:val="Kpr"/>
@@ -13863,7 +15035,7 @@
         </w:rPr>
         <w:t xml:space="preserve">(1), 1. </w:t>
       </w:r>
-      <w:hyperlink r:id="rId35" w:history="1">
+      <w:hyperlink r:id="rId39" w:history="1">
         <w:r>
           <w:rPr>
             <w:rStyle w:val="Kpr"/>
@@ -14187,7 +15359,7 @@
         </w:rPr>
         <w:t>, 123-133. </w:t>
       </w:r>
-      <w:hyperlink r:id="rId36" w:tgtFrame="_blank" w:history="1">
+      <w:hyperlink r:id="rId40" w:tgtFrame="_blank" w:history="1">
         <w:r>
           <w:rPr>
             <w:rStyle w:val="Kpr"/>
@@ -14253,7 +15425,7 @@
         </w:rPr>
         <w:t xml:space="preserve">. </w:t>
       </w:r>
-      <w:hyperlink r:id="rId37" w:history="1">
+      <w:hyperlink r:id="rId41" w:history="1">
         <w:r>
           <w:rPr>
             <w:rStyle w:val="Kpr"/>
@@ -14330,7 +15502,7 @@
         </w:rPr>
         <w:t xml:space="preserve">, 7009. </w:t>
       </w:r>
-      <w:hyperlink r:id="rId38" w:history="1">
+      <w:hyperlink r:id="rId42" w:history="1">
         <w:r>
           <w:rPr>
             <w:rStyle w:val="Kpr"/>
@@ -14390,7 +15562,7 @@
         </w:rPr>
         <w:t>(1). </w:t>
       </w:r>
-      <w:hyperlink r:id="rId39" w:tgtFrame="_blank" w:history="1">
+      <w:hyperlink r:id="rId43" w:tgtFrame="_blank" w:history="1">
         <w:r>
           <w:rPr>
             <w:rStyle w:val="Kpr"/>
@@ -14419,7 +15591,6 @@
           <w:bCs/>
           <w:lang w:val="en-US"/>
         </w:rPr>
-        <w:lastRenderedPageBreak/>
         <w:t>Qafisheh</w:t>
       </w:r>
       <w:proofErr w:type="spellEnd"/>
@@ -14462,7 +15633,7 @@
         </w:rPr>
         <w:t xml:space="preserve">(3). </w:t>
       </w:r>
-      <w:hyperlink r:id="rId40" w:history="1">
+      <w:hyperlink r:id="rId44" w:history="1">
         <w:r>
           <w:rPr>
             <w:rStyle w:val="Kpr"/>
@@ -14554,7 +15725,7 @@
         </w:rPr>
         <w:t xml:space="preserve">(4). </w:t>
       </w:r>
-      <w:hyperlink r:id="rId41" w:history="1">
+      <w:hyperlink r:id="rId45" w:history="1">
         <w:r>
           <w:rPr>
             <w:rStyle w:val="Kpr"/>
@@ -14615,7 +15786,7 @@
         </w:rPr>
         <w:t xml:space="preserve">(9), 2844. </w:t>
       </w:r>
-      <w:hyperlink r:id="rId42" w:history="1">
+      <w:hyperlink r:id="rId46" w:history="1">
         <w:r>
           <w:rPr>
             <w:rStyle w:val="Kpr"/>
@@ -14674,7 +15845,7 @@
         </w:rPr>
         <w:t>(8), 3510. </w:t>
       </w:r>
-      <w:hyperlink r:id="rId43" w:tgtFrame="_blank" w:history="1">
+      <w:hyperlink r:id="rId47" w:tgtFrame="_blank" w:history="1">
         <w:r>
           <w:rPr>
             <w:rStyle w:val="Kpr"/>
@@ -14734,7 +15905,7 @@
         </w:rPr>
         <w:t>(3), 277-288. </w:t>
       </w:r>
-      <w:hyperlink r:id="rId44" w:history="1">
+      <w:hyperlink r:id="rId48" w:history="1">
         <w:r>
           <w:rPr>
             <w:rStyle w:val="Kpr"/>
@@ -14807,7 +15978,7 @@
         </w:rPr>
         <w:t xml:space="preserve">(2), 455. </w:t>
       </w:r>
-      <w:hyperlink r:id="rId45" w:history="1">
+      <w:hyperlink r:id="rId49" w:history="1">
         <w:r>
           <w:rPr>
             <w:rStyle w:val="Kpr"/>
@@ -15799,7 +16970,6 @@
   <w:style w:type="character" w:default="1" w:styleId="VarsaylanParagrafYazTipi">
     <w:name w:val="Default Paragraph Font"/>
     <w:uiPriority w:val="1"/>
-    <w:semiHidden/>
     <w:unhideWhenUsed/>
   </w:style>
   <w:style w:type="table" w:default="1" w:styleId="NormalTablo">

</xml_diff>